<commit_message>
feat(literature): build substantive thesis chapter 2 and verify Scopus/Q1 status
</commit_message>
<xml_diff>
--- a/backend/telegram_literature_output/FINAL_TELEGRAM_LITERATURE_RESEARCH.docx
+++ b/backend/telegram_literature_output/FINAL_TELEGRAM_LITERATURE_RESEARCH.docx
@@ -4,2477 +4,294 @@
   <w:body>
     <w:p>
       <w:pPr>
+        <w:pStyle w:val="Title"/>
         <w:jc w:val="center"/>
       </w:pPr>
       <w:r>
-        <w:rPr>
-          <w:rFonts w:ascii="Times New Roman" w:hAnsi="Times New Roman"/>
-          <w:b/>
-          <w:sz w:val="32"/>
-        </w:rPr>
-        <w:t>FINAL TELEGRAM LITERATURE RESEARCH</w:t>
-      </w:r>
-    </w:p>
-    <w:p>
-      <w:pPr>
-        <w:jc w:val="center"/>
-      </w:pPr>
-      <w:r>
-        <w:rPr>
-          <w:rFonts w:ascii="Times New Roman" w:hAnsi="Times New Roman"/>
-          <w:i/>
-          <w:sz w:val="20"/>
-        </w:rPr>
-        <w:t>Literature pipeline 2024–2026 | Audit &amp; evidence integrity report</w:t>
-      </w:r>
-    </w:p>
-    <w:p/>
-    <w:p>
-      <w:pPr>
-        <w:pStyle w:val="Heading1"/>
-      </w:pPr>
-      <w:r>
-        <w:t>1. Dataset Summary</w:t>
-      </w:r>
-    </w:p>
-    <w:tbl>
-      <w:tblPr>
-        <w:tblStyle w:val="TableGrid"/>
-        <w:tblW w:type="auto" w:w="0"/>
-        <w:jc w:val="center"/>
-        <w:tblLook w:firstColumn="1" w:firstRow="1" w:lastColumn="0" w:lastRow="0" w:noHBand="0" w:noVBand="1" w:val="04A0"/>
-      </w:tblPr>
-      <w:tblGrid>
-        <w:gridCol w:w="4968"/>
-        <w:gridCol w:w="4968"/>
-      </w:tblGrid>
-      <w:tr>
-        <w:tc>
-          <w:tcPr>
-            <w:tcW w:type="dxa" w:w="4968"/>
-          </w:tcPr>
-          <w:p>
-            <w:r>
-              <w:t>Metric</w:t>
-            </w:r>
-          </w:p>
-        </w:tc>
-        <w:tc>
-          <w:tcPr>
-            <w:tcW w:type="dxa" w:w="4968"/>
-          </w:tcPr>
-          <w:p>
-            <w:r>
-              <w:t>Result</w:t>
-            </w:r>
-          </w:p>
-        </w:tc>
-      </w:tr>
-      <w:tr>
-        <w:tc>
-          <w:tcPr>
-            <w:tcW w:type="dxa" w:w="4968"/>
-          </w:tcPr>
-          <w:p>
-            <w:r>
-              <w:t>Master dataset</w:t>
-            </w:r>
-          </w:p>
-        </w:tc>
-        <w:tc>
-          <w:tcPr>
-            <w:tcW w:type="dxa" w:w="4968"/>
-          </w:tcPr>
-          <w:p>
-            <w:r>
-              <w:t>/Users/jevin/Documents/tesis_mbg/backend/telegram_literature_output/telegram_literature_master.csv</w:t>
-            </w:r>
-          </w:p>
-        </w:tc>
-      </w:tr>
-      <w:tr>
-        <w:tc>
-          <w:tcPr>
-            <w:tcW w:type="dxa" w:w="4968"/>
-          </w:tcPr>
-          <w:p>
-            <w:r>
-              <w:t>Total records</w:t>
-            </w:r>
-          </w:p>
-        </w:tc>
-        <w:tc>
-          <w:tcPr>
-            <w:tcW w:type="dxa" w:w="4968"/>
-          </w:tcPr>
-          <w:p>
-            <w:r>
-              <w:t>322</w:t>
-            </w:r>
-          </w:p>
-        </w:tc>
-      </w:tr>
-      <w:tr>
-        <w:tc>
-          <w:tcPr>
-            <w:tcW w:type="dxa" w:w="4968"/>
-          </w:tcPr>
-          <w:p>
-            <w:r>
-              <w:t>Total columns</w:t>
-            </w:r>
-          </w:p>
-        </w:tc>
-        <w:tc>
-          <w:tcPr>
-            <w:tcW w:type="dxa" w:w="4968"/>
-          </w:tcPr>
-          <w:p>
-            <w:r>
-              <w:t>46</w:t>
-            </w:r>
-          </w:p>
-        </w:tc>
-      </w:tr>
-      <w:tr>
-        <w:tc>
-          <w:tcPr>
-            <w:tcW w:type="dxa" w:w="4968"/>
-          </w:tcPr>
-          <w:p>
-            <w:r>
-              <w:t>Valid DOI syntax</w:t>
-            </w:r>
-          </w:p>
-        </w:tc>
-        <w:tc>
-          <w:tcPr>
-            <w:tcW w:type="dxa" w:w="4968"/>
-          </w:tcPr>
-          <w:p>
-            <w:r>
-              <w:t>308</w:t>
-            </w:r>
-          </w:p>
-        </w:tc>
-      </w:tr>
-      <w:tr>
-        <w:tc>
-          <w:tcPr>
-            <w:tcW w:type="dxa" w:w="4968"/>
-          </w:tcPr>
-          <w:p>
-            <w:r>
-              <w:t>Missing DOI</w:t>
-            </w:r>
-          </w:p>
-        </w:tc>
-        <w:tc>
-          <w:tcPr>
-            <w:tcW w:type="dxa" w:w="4968"/>
-          </w:tcPr>
-          <w:p>
-            <w:r>
-              <w:t>14</w:t>
-            </w:r>
-          </w:p>
-        </w:tc>
-      </w:tr>
-      <w:tr>
-        <w:tc>
-          <w:tcPr>
-            <w:tcW w:type="dxa" w:w="4968"/>
-          </w:tcPr>
-          <w:p>
-            <w:r>
-              <w:t>Invalid DOI syntax</w:t>
-            </w:r>
-          </w:p>
-        </w:tc>
-        <w:tc>
-          <w:tcPr>
-            <w:tcW w:type="dxa" w:w="4968"/>
-          </w:tcPr>
-          <w:p>
-            <w:r>
-              <w:t>0</w:t>
-            </w:r>
-          </w:p>
-        </w:tc>
-      </w:tr>
-    </w:tbl>
-    <w:p>
-      <w:pPr>
-        <w:pStyle w:val="Heading1"/>
-      </w:pPr>
-      <w:r>
-        <w:t>2. Scopus and Q1 Verification Status</w:t>
+        <w:t>TELEGRAM BOT LITERATURE RESEARCH 2024–2026</w:t>
       </w:r>
     </w:p>
     <w:p>
       <w:r>
-        <w:rPr>
-          <w:b/>
-        </w:rPr>
-        <w:t xml:space="preserve">Integrity rule: </w:t>
-      </w:r>
-      <w:r>
-        <w:t>Scopus/Q1 is not considered verified merely because a paper is a candidate. Where independent verification is unavailable, the status is treated as UNVERIFIED.</w:t>
+        <w:t>Literature Evidence, Method Benchmark, Research Gap, and Relevance to Thesis</w:t>
       </w:r>
     </w:p>
     <w:p>
       <w:r>
-        <w:t>scopus_status: {'UNVERIFIED': 322}</w:t>
-      </w:r>
-    </w:p>
-    <w:p>
-      <w:r>
-        <w:t>scopus_source: {'REQUIRES_SCOPUS_VERIFICATION': 322}</w:t>
-      </w:r>
-    </w:p>
-    <w:p>
-      <w:r>
-        <w:t>quartile: {'UNVERIFIED': 322}</w:t>
-      </w:r>
-    </w:p>
-    <w:p>
-      <w:r>
-        <w:t>quartile_year: {'UNVERIFIED': 322}</w:t>
-      </w:r>
-    </w:p>
-    <w:p>
-      <w:r>
-        <w:t>q1_candidate_status: {'SCOPUS_UNVERIFIED': 177, 'OTHER': 145}</w:t>
+        <w:br w:type="page"/>
       </w:r>
     </w:p>
     <w:p>
       <w:pPr>
         <w:pStyle w:val="Heading1"/>
+        <w:jc w:val="center"/>
       </w:pPr>
       <w:r>
-        <w:t>3. Relevance Screening</w:t>
-      </w:r>
-    </w:p>
-    <w:tbl>
-      <w:tblPr>
-        <w:tblStyle w:val="TableGrid"/>
-        <w:tblW w:type="auto" w:w="0"/>
-        <w:jc w:val="center"/>
-        <w:tblLook w:firstColumn="1" w:firstRow="1" w:lastColumn="0" w:lastRow="0" w:noHBand="0" w:noVBand="1" w:val="04A0"/>
-      </w:tblPr>
-      <w:tblGrid>
-        <w:gridCol w:w="4968"/>
-        <w:gridCol w:w="4968"/>
-      </w:tblGrid>
-      <w:tr>
-        <w:tc>
-          <w:tcPr>
-            <w:tcW w:type="dxa" w:w="4968"/>
-          </w:tcPr>
-          <w:p>
-            <w:r>
-              <w:t>Category</w:t>
-            </w:r>
-          </w:p>
-        </w:tc>
-        <w:tc>
-          <w:tcPr>
-            <w:tcW w:type="dxa" w:w="4968"/>
-          </w:tcPr>
-          <w:p>
-            <w:r>
-              <w:t>Records</w:t>
-            </w:r>
-          </w:p>
-        </w:tc>
-      </w:tr>
-      <w:tr>
-        <w:tc>
-          <w:tcPr>
-            <w:tcW w:type="dxa" w:w="4968"/>
-          </w:tcPr>
-          <w:p>
-            <w:r>
-              <w:t>JOURNAL</w:t>
-            </w:r>
-          </w:p>
-        </w:tc>
-        <w:tc>
-          <w:tcPr>
-            <w:tcW w:type="dxa" w:w="4968"/>
-          </w:tcPr>
-          <w:p>
-            <w:r>
-              <w:t>209</w:t>
-            </w:r>
-          </w:p>
-        </w:tc>
-      </w:tr>
-      <w:tr>
-        <w:tc>
-          <w:tcPr>
-            <w:tcW w:type="dxa" w:w="4968"/>
-          </w:tcPr>
-          <w:p>
-            <w:r>
-              <w:t>CONFERENCE</w:t>
-            </w:r>
-          </w:p>
-        </w:tc>
-        <w:tc>
-          <w:tcPr>
-            <w:tcW w:type="dxa" w:w="4968"/>
-          </w:tcPr>
-          <w:p>
-            <w:r>
-              <w:t>60</w:t>
-            </w:r>
-          </w:p>
-        </w:tc>
-      </w:tr>
-      <w:tr>
-        <w:tc>
-          <w:tcPr>
-            <w:tcW w:type="dxa" w:w="4968"/>
-          </w:tcPr>
-          <w:p>
-            <w:r>
-              <w:t>PREPRINT</w:t>
-            </w:r>
-          </w:p>
-        </w:tc>
-        <w:tc>
-          <w:tcPr>
-            <w:tcW w:type="dxa" w:w="4968"/>
-          </w:tcPr>
-          <w:p>
-            <w:r>
-              <w:t>26</w:t>
-            </w:r>
-          </w:p>
-        </w:tc>
-      </w:tr>
-      <w:tr>
-        <w:tc>
-          <w:tcPr>
-            <w:tcW w:type="dxa" w:w="4968"/>
-          </w:tcPr>
-          <w:p>
-            <w:r>
-              <w:t>BOOK</w:t>
-            </w:r>
-          </w:p>
-        </w:tc>
-        <w:tc>
-          <w:tcPr>
-            <w:tcW w:type="dxa" w:w="4968"/>
-          </w:tcPr>
-          <w:p>
-            <w:r>
-              <w:t>10</w:t>
-            </w:r>
-          </w:p>
-        </w:tc>
-      </w:tr>
-      <w:tr>
-        <w:tc>
-          <w:tcPr>
-            <w:tcW w:type="dxa" w:w="4968"/>
-          </w:tcPr>
-          <w:p>
-            <w:r>
-              <w:t>DISSERTATION</w:t>
-            </w:r>
-          </w:p>
-        </w:tc>
-        <w:tc>
-          <w:tcPr>
-            <w:tcW w:type="dxa" w:w="4968"/>
-          </w:tcPr>
-          <w:p>
-            <w:r>
-              <w:t>9</w:t>
-            </w:r>
-          </w:p>
-        </w:tc>
-      </w:tr>
-      <w:tr>
-        <w:tc>
-          <w:tcPr>
-            <w:tcW w:type="dxa" w:w="4968"/>
-          </w:tcPr>
-          <w:p>
-            <w:r>
-              <w:t>REPORT</w:t>
-            </w:r>
-          </w:p>
-        </w:tc>
-        <w:tc>
-          <w:tcPr>
-            <w:tcW w:type="dxa" w:w="4968"/>
-          </w:tcPr>
-          <w:p>
-            <w:r>
-              <w:t>2</w:t>
-            </w:r>
-          </w:p>
-        </w:tc>
-      </w:tr>
-      <w:tr>
-        <w:tc>
-          <w:tcPr>
-            <w:tcW w:type="dxa" w:w="4968"/>
-          </w:tcPr>
-          <w:p>
-            <w:r>
-              <w:t>REVIEW</w:t>
-            </w:r>
-          </w:p>
-        </w:tc>
-        <w:tc>
-          <w:tcPr>
-            <w:tcW w:type="dxa" w:w="4968"/>
-          </w:tcPr>
-          <w:p>
-            <w:r>
-              <w:t>2</w:t>
-            </w:r>
-          </w:p>
-        </w:tc>
-      </w:tr>
-      <w:tr>
-        <w:tc>
-          <w:tcPr>
-            <w:tcW w:type="dxa" w:w="4968"/>
-          </w:tcPr>
-          <w:p>
-            <w:r>
-              <w:t>OTHER</w:t>
-            </w:r>
-          </w:p>
-        </w:tc>
-        <w:tc>
-          <w:tcPr>
-            <w:tcW w:type="dxa" w:w="4968"/>
-          </w:tcPr>
-          <w:p>
-            <w:r>
-              <w:t>2</w:t>
-            </w:r>
-          </w:p>
-        </w:tc>
-      </w:tr>
-      <w:tr>
-        <w:tc>
-          <w:tcPr>
-            <w:tcW w:type="dxa" w:w="4968"/>
-          </w:tcPr>
-          <w:p>
-            <w:r>
-              <w:t>DATASET</w:t>
-            </w:r>
-          </w:p>
-        </w:tc>
-        <w:tc>
-          <w:tcPr>
-            <w:tcW w:type="dxa" w:w="4968"/>
-          </w:tcPr>
-          <w:p>
-            <w:r>
-              <w:t>1</w:t>
-            </w:r>
-          </w:p>
-        </w:tc>
-      </w:tr>
-      <w:tr>
-        <w:tc>
-          <w:tcPr>
-            <w:tcW w:type="dxa" w:w="4968"/>
-          </w:tcPr>
-          <w:p>
-            <w:r>
-              <w:t>SOFTWARE</w:t>
-            </w:r>
-          </w:p>
-        </w:tc>
-        <w:tc>
-          <w:tcPr>
-            <w:tcW w:type="dxa" w:w="4968"/>
-          </w:tcPr>
-          <w:p>
-            <w:r>
-              <w:t>1</w:t>
-            </w:r>
-          </w:p>
-        </w:tc>
-      </w:tr>
-    </w:tbl>
-    <w:p>
-      <w:pPr>
-        <w:pStyle w:val="Heading1"/>
-      </w:pPr>
-      <w:r>
-        <w:t>4. Literature Records</w:t>
-      </w:r>
-    </w:p>
-    <w:tbl>
-      <w:tblPr>
-        <w:tblStyle w:val="TableGrid"/>
-        <w:tblW w:type="auto" w:w="0"/>
-        <w:jc w:val="center"/>
-        <w:tblLook w:firstColumn="1" w:firstRow="1" w:lastColumn="0" w:lastRow="0" w:noHBand="0" w:noVBand="1" w:val="04A0"/>
-      </w:tblPr>
-      <w:tblGrid>
-        <w:gridCol w:w="2484"/>
-        <w:gridCol w:w="2484"/>
-        <w:gridCol w:w="2484"/>
-        <w:gridCol w:w="2484"/>
-      </w:tblGrid>
-      <w:tr>
-        <w:tc>
-          <w:tcPr>
-            <w:tcW w:type="dxa" w:w="2484"/>
-          </w:tcPr>
-          <w:p>
-            <w:r>
-              <w:t>title</w:t>
-            </w:r>
-          </w:p>
-        </w:tc>
-        <w:tc>
-          <w:tcPr>
-            <w:tcW w:type="dxa" w:w="2484"/>
-          </w:tcPr>
-          <w:p>
-            <w:r>
-              <w:t>doi</w:t>
-            </w:r>
-          </w:p>
-        </w:tc>
-        <w:tc>
-          <w:tcPr>
-            <w:tcW w:type="dxa" w:w="2484"/>
-          </w:tcPr>
-          <w:p>
-            <w:r>
-              <w:t>document_category</w:t>
-            </w:r>
-          </w:p>
-        </w:tc>
-        <w:tc>
-          <w:tcPr>
-            <w:tcW w:type="dxa" w:w="2484"/>
-          </w:tcPr>
-          <w:p>
-            <w:r>
-              <w:t>telegram_relevance_score</w:t>
-            </w:r>
-          </w:p>
-        </w:tc>
-      </w:tr>
-      <w:tr>
-        <w:tc>
-          <w:tcPr>
-            <w:tcW w:type="dxa" w:w="2484"/>
-          </w:tcPr>
-          <w:p>
-            <w:r>
-              <w:t>A Large-Scale Study of Telegram Bots</w:t>
-            </w:r>
-          </w:p>
-        </w:tc>
-        <w:tc>
-          <w:tcPr>
-            <w:tcW w:type="dxa" w:w="2484"/>
-          </w:tcPr>
-          <w:p>
-            <w:r/>
-          </w:p>
-        </w:tc>
-        <w:tc>
-          <w:tcPr>
-            <w:tcW w:type="dxa" w:w="2484"/>
-          </w:tcPr>
-          <w:p>
-            <w:r>
-              <w:t>PREPRINT</w:t>
-            </w:r>
-          </w:p>
-        </w:tc>
-        <w:tc>
-          <w:tcPr>
-            <w:tcW w:type="dxa" w:w="2484"/>
-          </w:tcPr>
-          <w:p>
-            <w:r>
-              <w:t>25</w:t>
-            </w:r>
-          </w:p>
-        </w:tc>
-      </w:tr>
-      <w:tr>
-        <w:tc>
-          <w:tcPr>
-            <w:tcW w:type="dxa" w:w="2484"/>
-          </w:tcPr>
-          <w:p>
-            <w:r>
-              <w:t>Development of a Methodology for Assessing the Quality and Communication Capabilities of Government Telegram Bots</w:t>
-            </w:r>
-          </w:p>
-        </w:tc>
-        <w:tc>
-          <w:tcPr>
-            <w:tcW w:type="dxa" w:w="2484"/>
-          </w:tcPr>
-          <w:p>
-            <w:r>
-              <w:t>10.1109/comsds61892.2024.10502066</w:t>
-            </w:r>
-          </w:p>
-        </w:tc>
-        <w:tc>
-          <w:tcPr>
-            <w:tcW w:type="dxa" w:w="2484"/>
-          </w:tcPr>
-          <w:p>
-            <w:r>
-              <w:t>CONFERENCE</w:t>
-            </w:r>
-          </w:p>
-        </w:tc>
-        <w:tc>
-          <w:tcPr>
-            <w:tcW w:type="dxa" w:w="2484"/>
-          </w:tcPr>
-          <w:p>
-            <w:r>
-              <w:t>25</w:t>
-            </w:r>
-          </w:p>
-        </w:tc>
-      </w:tr>
-      <w:tr>
-        <w:tc>
-          <w:tcPr>
-            <w:tcW w:type="dxa" w:w="2484"/>
-          </w:tcPr>
-          <w:p>
-            <w:r>
-              <w:t>AI detection of drug activity in Telegram bots and groups for security applications</w:t>
-            </w:r>
-          </w:p>
-        </w:tc>
-        <w:tc>
-          <w:tcPr>
-            <w:tcW w:type="dxa" w:w="2484"/>
-          </w:tcPr>
-          <w:p>
-            <w:r/>
-          </w:p>
-        </w:tc>
-        <w:tc>
-          <w:tcPr>
-            <w:tcW w:type="dxa" w:w="2484"/>
-          </w:tcPr>
-          <w:p>
-            <w:r>
-              <w:t>REPORT</w:t>
-            </w:r>
-          </w:p>
-        </w:tc>
-        <w:tc>
-          <w:tcPr>
-            <w:tcW w:type="dxa" w:w="2484"/>
-          </w:tcPr>
-          <w:p>
-            <w:r>
-              <w:t>25</w:t>
-            </w:r>
-          </w:p>
-        </w:tc>
-      </w:tr>
-      <w:tr>
-        <w:tc>
-          <w:tcPr>
-            <w:tcW w:type="dxa" w:w="2484"/>
-          </w:tcPr>
-          <w:p>
-            <w:r>
-              <w:t>Using AI in Telegram Bots for Earthquake Information Delivery and Analysis</w:t>
-            </w:r>
-          </w:p>
-        </w:tc>
-        <w:tc>
-          <w:tcPr>
-            <w:tcW w:type="dxa" w:w="2484"/>
-          </w:tcPr>
-          <w:p>
-            <w:r>
-              <w:t>10.46880/tamika.vol5no1.pp110-115</w:t>
-            </w:r>
-          </w:p>
-        </w:tc>
-        <w:tc>
-          <w:tcPr>
-            <w:tcW w:type="dxa" w:w="2484"/>
-          </w:tcPr>
-          <w:p>
-            <w:r>
-              <w:t>JOURNAL</w:t>
-            </w:r>
-          </w:p>
-        </w:tc>
-        <w:tc>
-          <w:tcPr>
-            <w:tcW w:type="dxa" w:w="2484"/>
-          </w:tcPr>
-          <w:p>
-            <w:r>
-              <w:t>25</w:t>
-            </w:r>
-          </w:p>
-        </w:tc>
-      </w:tr>
-      <w:tr>
-        <w:tc>
-          <w:tcPr>
-            <w:tcW w:type="dxa" w:w="2484"/>
-          </w:tcPr>
-          <w:p>
-            <w:r>
-              <w:t>Design and Development of a Ship Fuel Tank Volume Height Monitoring System Using the JSN-SR04T Sensor Based on IoT Telegram Bots with Solar Panel Energy</w:t>
-            </w:r>
-          </w:p>
-        </w:tc>
-        <w:tc>
-          <w:tcPr>
-            <w:tcW w:type="dxa" w:w="2484"/>
-          </w:tcPr>
-          <w:p>
-            <w:r>
-              <w:t>10.2991/978-94-6463-628-4_3</w:t>
-            </w:r>
-          </w:p>
-        </w:tc>
-        <w:tc>
-          <w:tcPr>
-            <w:tcW w:type="dxa" w:w="2484"/>
-          </w:tcPr>
-          <w:p>
-            <w:r>
-              <w:t>BOOK</w:t>
-            </w:r>
-          </w:p>
-        </w:tc>
-        <w:tc>
-          <w:tcPr>
-            <w:tcW w:type="dxa" w:w="2484"/>
-          </w:tcPr>
-          <w:p>
-            <w:r>
-              <w:t>25</w:t>
-            </w:r>
-          </w:p>
-        </w:tc>
-      </w:tr>
-      <w:tr>
-        <w:tc>
-          <w:tcPr>
-            <w:tcW w:type="dxa" w:w="2484"/>
-          </w:tcPr>
-          <w:p>
-            <w:r>
-              <w:t>Implementasi Telegram Bot berbasis OCR (Optical Character Recognition) dan NLP (Natural Language Processing) untuk Pencatatan Penjualan pada UMKM</w:t>
-            </w:r>
-          </w:p>
-        </w:tc>
-        <w:tc>
-          <w:tcPr>
-            <w:tcW w:type="dxa" w:w="2484"/>
-          </w:tcPr>
-          <w:p>
-            <w:r>
-              <w:t>10.69930/jtsm.v3i4.864</w:t>
-            </w:r>
-          </w:p>
-        </w:tc>
-        <w:tc>
-          <w:tcPr>
-            <w:tcW w:type="dxa" w:w="2484"/>
-          </w:tcPr>
-          <w:p>
-            <w:r>
-              <w:t>JOURNAL</w:t>
-            </w:r>
-          </w:p>
-        </w:tc>
-        <w:tc>
-          <w:tcPr>
-            <w:tcW w:type="dxa" w:w="2484"/>
-          </w:tcPr>
-          <w:p>
-            <w:r>
-              <w:t>23</w:t>
-            </w:r>
-          </w:p>
-        </w:tc>
-      </w:tr>
-      <w:tr>
-        <w:tc>
-          <w:tcPr>
-            <w:tcW w:type="dxa" w:w="2484"/>
-          </w:tcPr>
-          <w:p>
-            <w:r>
-              <w:t>RANCANG BANGUN SISTEM CHATBOT PEMESANANMENU MAKANAN DAN MINUMAN PADA RESTORAN BERBASIS TELEGRAM BOT DENGAN PENDEKATAN NATURAL LANGUAGE PROCESSING</w:t>
-            </w:r>
-          </w:p>
-        </w:tc>
-        <w:tc>
-          <w:tcPr>
-            <w:tcW w:type="dxa" w:w="2484"/>
-          </w:tcPr>
-          <w:p>
-            <w:r>
-              <w:t>10.24843/spektrum.2024.v11.i02.p24</w:t>
-            </w:r>
-          </w:p>
-        </w:tc>
-        <w:tc>
-          <w:tcPr>
-            <w:tcW w:type="dxa" w:w="2484"/>
-          </w:tcPr>
-          <w:p>
-            <w:r>
-              <w:t>JOURNAL</w:t>
-            </w:r>
-          </w:p>
-        </w:tc>
-        <w:tc>
-          <w:tcPr>
-            <w:tcW w:type="dxa" w:w="2484"/>
-          </w:tcPr>
-          <w:p>
-            <w:r>
-              <w:t>23</w:t>
-            </w:r>
-          </w:p>
-        </w:tc>
-      </w:tr>
-      <w:tr>
-        <w:tc>
-          <w:tcPr>
-            <w:tcW w:type="dxa" w:w="2484"/>
-          </w:tcPr>
-          <w:p>
-            <w:r>
-              <w:t>Telegram Bot for Calorie Intake Tracking Using Natural Language Processing</w:t>
-            </w:r>
-          </w:p>
-        </w:tc>
-        <w:tc>
-          <w:tcPr>
-            <w:tcW w:type="dxa" w:w="2484"/>
-          </w:tcPr>
-          <w:p>
-            <w:r/>
-          </w:p>
-        </w:tc>
-        <w:tc>
-          <w:tcPr>
-            <w:tcW w:type="dxa" w:w="2484"/>
-          </w:tcPr>
-          <w:p>
-            <w:r>
-              <w:t>DISSERTATION</w:t>
-            </w:r>
-          </w:p>
-        </w:tc>
-        <w:tc>
-          <w:tcPr>
-            <w:tcW w:type="dxa" w:w="2484"/>
-          </w:tcPr>
-          <w:p>
-            <w:r>
-              <w:t>19</w:t>
-            </w:r>
-          </w:p>
-        </w:tc>
-      </w:tr>
-      <w:tr>
-        <w:tc>
-          <w:tcPr>
-            <w:tcW w:type="dxa" w:w="2484"/>
-          </w:tcPr>
-          <w:p>
-            <w:r>
-              <w:t>Development of a Telegram bot for processing music content using artificial intelligence</w:t>
-            </w:r>
-          </w:p>
-        </w:tc>
-        <w:tc>
-          <w:tcPr>
-            <w:tcW w:type="dxa" w:w="2484"/>
-          </w:tcPr>
-          <w:p>
-            <w:r/>
-          </w:p>
-        </w:tc>
-        <w:tc>
-          <w:tcPr>
-            <w:tcW w:type="dxa" w:w="2484"/>
-          </w:tcPr>
-          <w:p>
-            <w:r>
-              <w:t>DISSERTATION</w:t>
-            </w:r>
-          </w:p>
-        </w:tc>
-        <w:tc>
-          <w:tcPr>
-            <w:tcW w:type="dxa" w:w="2484"/>
-          </w:tcPr>
-          <w:p>
-            <w:r>
-              <w:t>19</w:t>
-            </w:r>
-          </w:p>
-        </w:tc>
-      </w:tr>
-      <w:tr>
-        <w:tc>
-          <w:tcPr>
-            <w:tcW w:type="dxa" w:w="2484"/>
-          </w:tcPr>
-          <w:p>
-            <w:r>
-              <w:t>Development of a multifunctional artificial intelligence based Telegram bot for supporting school education</w:t>
-            </w:r>
-          </w:p>
-        </w:tc>
-        <w:tc>
-          <w:tcPr>
-            <w:tcW w:type="dxa" w:w="2484"/>
-          </w:tcPr>
-          <w:p>
-            <w:r>
-              <w:t>10.65247/3105-3432-2026-2.01</w:t>
-            </w:r>
-          </w:p>
-        </w:tc>
-        <w:tc>
-          <w:tcPr>
-            <w:tcW w:type="dxa" w:w="2484"/>
-          </w:tcPr>
-          <w:p>
-            <w:r>
-              <w:t>JOURNAL</w:t>
-            </w:r>
-          </w:p>
-        </w:tc>
-        <w:tc>
-          <w:tcPr>
-            <w:tcW w:type="dxa" w:w="2484"/>
-          </w:tcPr>
-          <w:p>
-            <w:r>
-              <w:t>19</w:t>
-            </w:r>
-          </w:p>
-        </w:tc>
-      </w:tr>
-      <w:tr>
-        <w:tc>
-          <w:tcPr>
-            <w:tcW w:type="dxa" w:w="2484"/>
-          </w:tcPr>
-          <w:p>
-            <w:r>
-              <w:t>Revolutionizing Skin Cancer Diagnosis with AI: Integrating YOLO-Based Lesion Detection into a Telegram Chatbot</w:t>
-            </w:r>
-          </w:p>
-        </w:tc>
-        <w:tc>
-          <w:tcPr>
-            <w:tcW w:type="dxa" w:w="2484"/>
-          </w:tcPr>
-          <w:p>
-            <w:r>
-              <w:t>10.51584/ijrias.2026.11060094</w:t>
-            </w:r>
-          </w:p>
-        </w:tc>
-        <w:tc>
-          <w:tcPr>
-            <w:tcW w:type="dxa" w:w="2484"/>
-          </w:tcPr>
-          <w:p>
-            <w:r>
-              <w:t>JOURNAL</w:t>
-            </w:r>
-          </w:p>
-        </w:tc>
-        <w:tc>
-          <w:tcPr>
-            <w:tcW w:type="dxa" w:w="2484"/>
-          </w:tcPr>
-          <w:p>
-            <w:r>
-              <w:t>19</w:t>
-            </w:r>
-          </w:p>
-        </w:tc>
-      </w:tr>
-      <w:tr>
-        <w:tc>
-          <w:tcPr>
-            <w:tcW w:type="dxa" w:w="2484"/>
-          </w:tcPr>
-          <w:p>
-            <w:r>
-              <w:t>LPG Gas Leak Detection System and LPG Fire Classification Based on Internet of Things and Artificial Intelligence with Telegram Bot as a Monitoring Tool</w:t>
-            </w:r>
-          </w:p>
-        </w:tc>
-        <w:tc>
-          <w:tcPr>
-            <w:tcW w:type="dxa" w:w="2484"/>
-          </w:tcPr>
-          <w:p>
-            <w:r>
-              <w:t>10.30998/faktorexacta.v17i3.21920</w:t>
-            </w:r>
-          </w:p>
-        </w:tc>
-        <w:tc>
-          <w:tcPr>
-            <w:tcW w:type="dxa" w:w="2484"/>
-          </w:tcPr>
-          <w:p>
-            <w:r>
-              <w:t>JOURNAL</w:t>
-            </w:r>
-          </w:p>
-        </w:tc>
-        <w:tc>
-          <w:tcPr>
-            <w:tcW w:type="dxa" w:w="2484"/>
-          </w:tcPr>
-          <w:p>
-            <w:r>
-              <w:t>19</w:t>
-            </w:r>
-          </w:p>
-        </w:tc>
-      </w:tr>
-      <w:tr>
-        <w:tc>
-          <w:tcPr>
-            <w:tcW w:type="dxa" w:w="2484"/>
-          </w:tcPr>
-          <w:p>
-            <w:r>
-              <w:t>Telegram bot for providing reference materials on first aid based on artificial intelligence models</w:t>
-            </w:r>
-          </w:p>
-        </w:tc>
-        <w:tc>
-          <w:tcPr>
-            <w:tcW w:type="dxa" w:w="2484"/>
-          </w:tcPr>
-          <w:p>
-            <w:r/>
-          </w:p>
-        </w:tc>
-        <w:tc>
-          <w:tcPr>
-            <w:tcW w:type="dxa" w:w="2484"/>
-          </w:tcPr>
-          <w:p>
-            <w:r>
-              <w:t>DISSERTATION</w:t>
-            </w:r>
-          </w:p>
-        </w:tc>
-        <w:tc>
-          <w:tcPr>
-            <w:tcW w:type="dxa" w:w="2484"/>
-          </w:tcPr>
-          <w:p>
-            <w:r>
-              <w:t>19</w:t>
-            </w:r>
-          </w:p>
-        </w:tc>
-      </w:tr>
-      <w:tr>
-        <w:tc>
-          <w:tcPr>
-            <w:tcW w:type="dxa" w:w="2484"/>
-          </w:tcPr>
-          <w:p>
-            <w:r>
-              <w:t>Question Answering System pada Chatbot Telegram Menggunakan Large Language Models (LLM) dan Langchain (Studi Kasus UU Kesehatan)</w:t>
-            </w:r>
-          </w:p>
-        </w:tc>
-        <w:tc>
-          <w:tcPr>
-            <w:tcW w:type="dxa" w:w="2484"/>
-          </w:tcPr>
-          <w:p>
-            <w:r>
-              <w:t>10.57152/malcom.v4i3.1378</w:t>
-            </w:r>
-          </w:p>
-        </w:tc>
-        <w:tc>
-          <w:tcPr>
-            <w:tcW w:type="dxa" w:w="2484"/>
-          </w:tcPr>
-          <w:p>
-            <w:r>
-              <w:t>JOURNAL</w:t>
-            </w:r>
-          </w:p>
-        </w:tc>
-        <w:tc>
-          <w:tcPr>
-            <w:tcW w:type="dxa" w:w="2484"/>
-          </w:tcPr>
-          <w:p>
-            <w:r>
-              <w:t>17</w:t>
-            </w:r>
-          </w:p>
-        </w:tc>
-      </w:tr>
-      <w:tr>
-        <w:tc>
-          <w:tcPr>
-            <w:tcW w:type="dxa" w:w="2484"/>
-          </w:tcPr>
-          <w:p>
-            <w:r>
-              <w:t>Schema Prevalence and Variation: A Study of 7500 Young Schema Questionnaires from Iranian Telegram Bot Users</w:t>
-            </w:r>
-          </w:p>
-        </w:tc>
-        <w:tc>
-          <w:tcPr>
-            <w:tcW w:type="dxa" w:w="2484"/>
-          </w:tcPr>
-          <w:p>
-            <w:r>
-              <w:t>10.61838/kman.cp.psynexus.3.3</w:t>
-            </w:r>
-          </w:p>
-        </w:tc>
-        <w:tc>
-          <w:tcPr>
-            <w:tcW w:type="dxa" w:w="2484"/>
-          </w:tcPr>
-          <w:p>
-            <w:r>
-              <w:t>JOURNAL</w:t>
-            </w:r>
-          </w:p>
-        </w:tc>
-        <w:tc>
-          <w:tcPr>
-            <w:tcW w:type="dxa" w:w="2484"/>
-          </w:tcPr>
-          <w:p>
-            <w:r>
-              <w:t>15</w:t>
-            </w:r>
-          </w:p>
-        </w:tc>
-      </w:tr>
-      <w:tr>
-        <w:tc>
-          <w:tcPr>
-            <w:tcW w:type="dxa" w:w="2484"/>
-          </w:tcPr>
-          <w:p>
-            <w:r>
-              <w:t>IoT-Based Automated Environmental Control System for Oyster Mushroom Cultivation Using ESP8266 and Telegram Bot</w:t>
-            </w:r>
-          </w:p>
-        </w:tc>
-        <w:tc>
-          <w:tcPr>
-            <w:tcW w:type="dxa" w:w="2484"/>
-          </w:tcPr>
-          <w:p>
-            <w:r>
-              <w:t>10.1109/icic64337.2024.10956269</w:t>
-            </w:r>
-          </w:p>
-        </w:tc>
-        <w:tc>
-          <w:tcPr>
-            <w:tcW w:type="dxa" w:w="2484"/>
-          </w:tcPr>
-          <w:p>
-            <w:r>
-              <w:t>CONFERENCE</w:t>
-            </w:r>
-          </w:p>
-        </w:tc>
-        <w:tc>
-          <w:tcPr>
-            <w:tcW w:type="dxa" w:w="2484"/>
-          </w:tcPr>
-          <w:p>
-            <w:r>
-              <w:t>15</w:t>
-            </w:r>
-          </w:p>
-        </w:tc>
-      </w:tr>
-      <w:tr>
-        <w:tc>
-          <w:tcPr>
-            <w:tcW w:type="dxa" w:w="2484"/>
-          </w:tcPr>
-          <w:p>
-            <w:r>
-              <w:t>Emergency System for the Elderly Based on Sound Sensor with Telegram Bot Notification and Voice Alarm</w:t>
-            </w:r>
-          </w:p>
-        </w:tc>
-        <w:tc>
-          <w:tcPr>
-            <w:tcW w:type="dxa" w:w="2484"/>
-          </w:tcPr>
-          <w:p>
-            <w:r>
-              <w:t>10.33795/jartel.v14i2.5274</w:t>
-            </w:r>
-          </w:p>
-        </w:tc>
-        <w:tc>
-          <w:tcPr>
-            <w:tcW w:type="dxa" w:w="2484"/>
-          </w:tcPr>
-          <w:p>
-            <w:r>
-              <w:t>JOURNAL</w:t>
-            </w:r>
-          </w:p>
-        </w:tc>
-        <w:tc>
-          <w:tcPr>
-            <w:tcW w:type="dxa" w:w="2484"/>
-          </w:tcPr>
-          <w:p>
-            <w:r>
-              <w:t>15</w:t>
-            </w:r>
-          </w:p>
-        </w:tc>
-      </w:tr>
-      <w:tr>
-        <w:tc>
-          <w:tcPr>
-            <w:tcW w:type="dxa" w:w="2484"/>
-          </w:tcPr>
-          <w:p>
-            <w:r>
-              <w:t>Telegram bot-based Flood Early Warning System with WSN Integration</w:t>
-            </w:r>
-          </w:p>
-        </w:tc>
-        <w:tc>
-          <w:tcPr>
-            <w:tcW w:type="dxa" w:w="2484"/>
-          </w:tcPr>
-          <w:p>
-            <w:r>
-              <w:t>10.33096/ilkom.v16i2.1699.151-160</w:t>
-            </w:r>
-          </w:p>
-        </w:tc>
-        <w:tc>
-          <w:tcPr>
-            <w:tcW w:type="dxa" w:w="2484"/>
-          </w:tcPr>
-          <w:p>
-            <w:r>
-              <w:t>JOURNAL</w:t>
-            </w:r>
-          </w:p>
-        </w:tc>
-        <w:tc>
-          <w:tcPr>
-            <w:tcW w:type="dxa" w:w="2484"/>
-          </w:tcPr>
-          <w:p>
-            <w:r>
-              <w:t>15</w:t>
-            </w:r>
-          </w:p>
-        </w:tc>
-      </w:tr>
-      <w:tr>
-        <w:tc>
-          <w:tcPr>
-            <w:tcW w:type="dxa" w:w="2484"/>
-          </w:tcPr>
-          <w:p>
-            <w:r>
-              <w:t>Development of an Informational Telegram Bot for a Logistics Company</w:t>
-            </w:r>
-          </w:p>
-        </w:tc>
-        <w:tc>
-          <w:tcPr>
-            <w:tcW w:type="dxa" w:w="2484"/>
-          </w:tcPr>
-          <w:p>
-            <w:r>
-              <w:t>10.33774/coe-2025-sgph8</w:t>
-            </w:r>
-          </w:p>
-        </w:tc>
-        <w:tc>
-          <w:tcPr>
-            <w:tcW w:type="dxa" w:w="2484"/>
-          </w:tcPr>
-          <w:p>
-            <w:r>
-              <w:t>PREPRINT</w:t>
-            </w:r>
-          </w:p>
-        </w:tc>
-        <w:tc>
-          <w:tcPr>
-            <w:tcW w:type="dxa" w:w="2484"/>
-          </w:tcPr>
-          <w:p>
-            <w:r>
-              <w:t>15</w:t>
-            </w:r>
-          </w:p>
-        </w:tc>
-      </w:tr>
-      <w:tr>
-        <w:tc>
-          <w:tcPr>
-            <w:tcW w:type="dxa" w:w="2484"/>
-          </w:tcPr>
-          <w:p>
-            <w:r>
-              <w:t>Innovative approaches to the diagnosis of premenstrual syndrome: the role of the Telegram bot in clinical practice</w:t>
-            </w:r>
-          </w:p>
-        </w:tc>
-        <w:tc>
-          <w:tcPr>
-            <w:tcW w:type="dxa" w:w="2484"/>
-          </w:tcPr>
-          <w:p>
-            <w:r>
-              <w:t>10.19163/1994-9480-2025-22-4-182-185</w:t>
-            </w:r>
-          </w:p>
-        </w:tc>
-        <w:tc>
-          <w:tcPr>
-            <w:tcW w:type="dxa" w:w="2484"/>
-          </w:tcPr>
-          <w:p>
-            <w:r>
-              <w:t>JOURNAL</w:t>
-            </w:r>
-          </w:p>
-        </w:tc>
-        <w:tc>
-          <w:tcPr>
-            <w:tcW w:type="dxa" w:w="2484"/>
-          </w:tcPr>
-          <w:p>
-            <w:r>
-              <w:t>15</w:t>
-            </w:r>
-          </w:p>
-        </w:tc>
-      </w:tr>
-      <w:tr>
-        <w:tc>
-          <w:tcPr>
-            <w:tcW w:type="dxa" w:w="2484"/>
-          </w:tcPr>
-          <w:p>
-            <w:r>
-              <w:t>A SYSTEM FOR COLLECTING STATISTICAL DATA ABOUT DEFECTS IN METAL STRUCTURES BASED ON TELEGRAM BOT</w:t>
-            </w:r>
-          </w:p>
-        </w:tc>
-        <w:tc>
-          <w:tcPr>
-            <w:tcW w:type="dxa" w:w="2484"/>
-          </w:tcPr>
-          <w:p>
-            <w:r>
-              <w:t>10.20998/2413-4295.2025.01.05</w:t>
-            </w:r>
-          </w:p>
-        </w:tc>
-        <w:tc>
-          <w:tcPr>
-            <w:tcW w:type="dxa" w:w="2484"/>
-          </w:tcPr>
-          <w:p>
-            <w:r>
-              <w:t>JOURNAL</w:t>
-            </w:r>
-          </w:p>
-        </w:tc>
-        <w:tc>
-          <w:tcPr>
-            <w:tcW w:type="dxa" w:w="2484"/>
-          </w:tcPr>
-          <w:p>
-            <w:r>
-              <w:t>15</w:t>
-            </w:r>
-          </w:p>
-        </w:tc>
-      </w:tr>
-      <w:tr>
-        <w:tc>
-          <w:tcPr>
-            <w:tcW w:type="dxa" w:w="2484"/>
-          </w:tcPr>
-          <w:p>
-            <w:r>
-              <w:t>Personalized Self-Assessment Tool Using a Telegram Bot: A Case Study on Data Structures and Algorithms</w:t>
-            </w:r>
-          </w:p>
-        </w:tc>
-        <w:tc>
-          <w:tcPr>
-            <w:tcW w:type="dxa" w:w="2484"/>
-          </w:tcPr>
-          <w:p>
-            <w:r>
-              <w:t>10.1109/educon60312.2024.10578697</w:t>
-            </w:r>
-          </w:p>
-        </w:tc>
-        <w:tc>
-          <w:tcPr>
-            <w:tcW w:type="dxa" w:w="2484"/>
-          </w:tcPr>
-          <w:p>
-            <w:r>
-              <w:t>CONFERENCE</w:t>
-            </w:r>
-          </w:p>
-        </w:tc>
-        <w:tc>
-          <w:tcPr>
-            <w:tcW w:type="dxa" w:w="2484"/>
-          </w:tcPr>
-          <w:p>
-            <w:r>
-              <w:t>15</w:t>
-            </w:r>
-          </w:p>
-        </w:tc>
-      </w:tr>
-      <w:tr>
-        <w:tc>
-          <w:tcPr>
-            <w:tcW w:type="dxa" w:w="2484"/>
-          </w:tcPr>
-          <w:p>
-            <w:r>
-              <w:t>Smart Accidental Alert and Location Tracking System Using Telegram Bot and GPS Technology</w:t>
-            </w:r>
-          </w:p>
-        </w:tc>
-        <w:tc>
-          <w:tcPr>
-            <w:tcW w:type="dxa" w:w="2484"/>
-          </w:tcPr>
-          <w:p>
-            <w:r>
-              <w:t>10.1007/978-981-97-3651-5_27</w:t>
-            </w:r>
-          </w:p>
-        </w:tc>
-        <w:tc>
-          <w:tcPr>
-            <w:tcW w:type="dxa" w:w="2484"/>
-          </w:tcPr>
-          <w:p>
-            <w:r>
-              <w:t>CONFERENCE</w:t>
-            </w:r>
-          </w:p>
-        </w:tc>
-        <w:tc>
-          <w:tcPr>
-            <w:tcW w:type="dxa" w:w="2484"/>
-          </w:tcPr>
-          <w:p>
-            <w:r>
-              <w:t>15</w:t>
-            </w:r>
-          </w:p>
-        </w:tc>
-      </w:tr>
-      <w:tr>
-        <w:tc>
-          <w:tcPr>
-            <w:tcW w:type="dxa" w:w="2484"/>
-          </w:tcPr>
-          <w:p>
-            <w:r>
-              <w:t>Development of a Telegram Bot for Automation of Reporting of Contractors in Construction</w:t>
-            </w:r>
-          </w:p>
-        </w:tc>
-        <w:tc>
-          <w:tcPr>
-            <w:tcW w:type="dxa" w:w="2484"/>
-          </w:tcPr>
-          <w:p>
-            <w:r>
-              <w:t>10.22213/2410-9304-2025-3-88-95</w:t>
-            </w:r>
-          </w:p>
-        </w:tc>
-        <w:tc>
-          <w:tcPr>
-            <w:tcW w:type="dxa" w:w="2484"/>
-          </w:tcPr>
-          <w:p>
-            <w:r>
-              <w:t>JOURNAL</w:t>
-            </w:r>
-          </w:p>
-        </w:tc>
-        <w:tc>
-          <w:tcPr>
-            <w:tcW w:type="dxa" w:w="2484"/>
-          </w:tcPr>
-          <w:p>
-            <w:r>
-              <w:t>15</w:t>
-            </w:r>
-          </w:p>
-        </w:tc>
-      </w:tr>
-      <w:tr>
-        <w:tc>
-          <w:tcPr>
-            <w:tcW w:type="dxa" w:w="2484"/>
-          </w:tcPr>
-          <w:p>
-            <w:r>
-              <w:t>Intelligent Cold Chain Security: Nano Power Temperature Sensors, ESP32 and Telegram Bot Integration for Temperature Assurance and Environmental Harm Prevention</w:t>
-            </w:r>
-          </w:p>
-        </w:tc>
-        <w:tc>
-          <w:tcPr>
-            <w:tcW w:type="dxa" w:w="2484"/>
-          </w:tcPr>
-          <w:p>
-            <w:r>
-              <w:t>10.13074/jent.2024.03.241492</w:t>
-            </w:r>
-          </w:p>
-        </w:tc>
-        <w:tc>
-          <w:tcPr>
-            <w:tcW w:type="dxa" w:w="2484"/>
-          </w:tcPr>
-          <w:p>
-            <w:r>
-              <w:t>JOURNAL</w:t>
-            </w:r>
-          </w:p>
-        </w:tc>
-        <w:tc>
-          <w:tcPr>
-            <w:tcW w:type="dxa" w:w="2484"/>
-          </w:tcPr>
-          <w:p>
-            <w:r>
-              <w:t>15</w:t>
-            </w:r>
-          </w:p>
-        </w:tc>
-      </w:tr>
-      <w:tr>
-        <w:tc>
-          <w:tcPr>
-            <w:tcW w:type="dxa" w:w="2484"/>
-          </w:tcPr>
-          <w:p>
-            <w:r>
-              <w:t>AN IOT-BASED AUTOMATED WATERING SYSTEM FOR PLANTS USING INTEGRATED FUZZY LOGIC AND TELEGRAM BOT</w:t>
-            </w:r>
-          </w:p>
-        </w:tc>
-        <w:tc>
-          <w:tcPr>
-            <w:tcW w:type="dxa" w:w="2484"/>
-          </w:tcPr>
-          <w:p>
-            <w:r>
-              <w:t>10.12962/j24068535.v22i2.a1191</w:t>
-            </w:r>
-          </w:p>
-        </w:tc>
-        <w:tc>
-          <w:tcPr>
-            <w:tcW w:type="dxa" w:w="2484"/>
-          </w:tcPr>
-          <w:p>
-            <w:r>
-              <w:t>JOURNAL</w:t>
-            </w:r>
-          </w:p>
-        </w:tc>
-        <w:tc>
-          <w:tcPr>
-            <w:tcW w:type="dxa" w:w="2484"/>
-          </w:tcPr>
-          <w:p>
-            <w:r>
-              <w:t>15</w:t>
-            </w:r>
-          </w:p>
-        </w:tc>
-      </w:tr>
-      <w:tr>
-        <w:tc>
-          <w:tcPr>
-            <w:tcW w:type="dxa" w:w="2484"/>
-          </w:tcPr>
-          <w:p>
-            <w:r>
-              <w:t>Telegram BOT Application Development Integration with Google Sheets for Sending Service Reporting</w:t>
-            </w:r>
-          </w:p>
-        </w:tc>
-        <w:tc>
-          <w:tcPr>
-            <w:tcW w:type="dxa" w:w="2484"/>
-          </w:tcPr>
-          <w:p>
-            <w:r>
-              <w:t>10.59934/jaiea.v4i3.1136</w:t>
-            </w:r>
-          </w:p>
-        </w:tc>
-        <w:tc>
-          <w:tcPr>
-            <w:tcW w:type="dxa" w:w="2484"/>
-          </w:tcPr>
-          <w:p>
-            <w:r>
-              <w:t>JOURNAL</w:t>
-            </w:r>
-          </w:p>
-        </w:tc>
-        <w:tc>
-          <w:tcPr>
-            <w:tcW w:type="dxa" w:w="2484"/>
-          </w:tcPr>
-          <w:p>
-            <w:r>
-              <w:t>15</w:t>
-            </w:r>
-          </w:p>
-        </w:tc>
-      </w:tr>
-      <w:tr>
-        <w:tc>
-          <w:tcPr>
-            <w:tcW w:type="dxa" w:w="2484"/>
-          </w:tcPr>
-          <w:p>
-            <w:r>
-              <w:t>Utilization of Telegram Bot for Integrated Data Visualization with Google Sheets at PT Telkom Cibitung</w:t>
-            </w:r>
-          </w:p>
-        </w:tc>
-        <w:tc>
-          <w:tcPr>
-            <w:tcW w:type="dxa" w:w="2484"/>
-          </w:tcPr>
-          <w:p>
-            <w:r>
-              <w:t>10.59934/jaiea.v4i3.1148</w:t>
-            </w:r>
-          </w:p>
-        </w:tc>
-        <w:tc>
-          <w:tcPr>
-            <w:tcW w:type="dxa" w:w="2484"/>
-          </w:tcPr>
-          <w:p>
-            <w:r>
-              <w:t>JOURNAL</w:t>
-            </w:r>
-          </w:p>
-        </w:tc>
-        <w:tc>
-          <w:tcPr>
-            <w:tcW w:type="dxa" w:w="2484"/>
-          </w:tcPr>
-          <w:p>
-            <w:r>
-              <w:t>15</w:t>
-            </w:r>
-          </w:p>
-        </w:tc>
-      </w:tr>
-      <w:tr>
-        <w:tc>
-          <w:tcPr>
-            <w:tcW w:type="dxa" w:w="2484"/>
-          </w:tcPr>
-          <w:p>
-            <w:r>
-              <w:t>Enhancing university education with AI: a Telegram bot leveraging RAG and external APIs for secure knowledge retrieval</w:t>
-            </w:r>
-          </w:p>
-        </w:tc>
-        <w:tc>
-          <w:tcPr>
-            <w:tcW w:type="dxa" w:w="2484"/>
-          </w:tcPr>
-          <w:p>
-            <w:r>
-              <w:t>10.48009/3_iis_2025_2025_133</w:t>
-            </w:r>
-          </w:p>
-        </w:tc>
-        <w:tc>
-          <w:tcPr>
-            <w:tcW w:type="dxa" w:w="2484"/>
-          </w:tcPr>
-          <w:p>
-            <w:r>
-              <w:t>JOURNAL</w:t>
-            </w:r>
-          </w:p>
-        </w:tc>
-        <w:tc>
-          <w:tcPr>
-            <w:tcW w:type="dxa" w:w="2484"/>
-          </w:tcPr>
-          <w:p>
-            <w:r>
-              <w:t>15</w:t>
-            </w:r>
-          </w:p>
-        </w:tc>
-      </w:tr>
-      <w:tr>
-        <w:tc>
-          <w:tcPr>
-            <w:tcW w:type="dxa" w:w="2484"/>
-          </w:tcPr>
-          <w:p>
-            <w:r>
-              <w:t>Enhancing Communication Security with a Telegram Bot for Encrypted Image Communication Using F5-LSB Steganography</w:t>
-            </w:r>
-          </w:p>
-        </w:tc>
-        <w:tc>
-          <w:tcPr>
-            <w:tcW w:type="dxa" w:w="2484"/>
-          </w:tcPr>
-          <w:p>
-            <w:r>
-              <w:t>10.1109/icoeca62351.2024.00037</w:t>
-            </w:r>
-          </w:p>
-        </w:tc>
-        <w:tc>
-          <w:tcPr>
-            <w:tcW w:type="dxa" w:w="2484"/>
-          </w:tcPr>
-          <w:p>
-            <w:r>
-              <w:t>CONFERENCE</w:t>
-            </w:r>
-          </w:p>
-        </w:tc>
-        <w:tc>
-          <w:tcPr>
-            <w:tcW w:type="dxa" w:w="2484"/>
-          </w:tcPr>
-          <w:p>
-            <w:r>
-              <w:t>15</w:t>
-            </w:r>
-          </w:p>
-        </w:tc>
-      </w:tr>
-      <w:tr>
-        <w:tc>
-          <w:tcPr>
-            <w:tcW w:type="dxa" w:w="2484"/>
-          </w:tcPr>
-          <w:p>
-            <w:r>
-              <w:t>Developing an Open-access Telegram Bot for Automated, estimation and IA-based interpreted of OpenQuake Ground-Motion intensity measures</w:t>
-            </w:r>
-          </w:p>
-        </w:tc>
-        <w:tc>
-          <w:tcPr>
-            <w:tcW w:type="dxa" w:w="2484"/>
-          </w:tcPr>
-          <w:p>
-            <w:r>
-              <w:t>10.31223/x5p468</w:t>
-            </w:r>
-          </w:p>
-        </w:tc>
-        <w:tc>
-          <w:tcPr>
-            <w:tcW w:type="dxa" w:w="2484"/>
-          </w:tcPr>
-          <w:p>
-            <w:r>
-              <w:t>PREPRINT</w:t>
-            </w:r>
-          </w:p>
-        </w:tc>
-        <w:tc>
-          <w:tcPr>
-            <w:tcW w:type="dxa" w:w="2484"/>
-          </w:tcPr>
-          <w:p>
-            <w:r>
-              <w:t>15</w:t>
-            </w:r>
-          </w:p>
-        </w:tc>
-      </w:tr>
-      <w:tr>
-        <w:tc>
-          <w:tcPr>
-            <w:tcW w:type="dxa" w:w="2484"/>
-          </w:tcPr>
-          <w:p>
-            <w:r>
-              <w:t>Security System in A Private Room Using Esp32 Microcontroller with Telegram Bot</w:t>
-            </w:r>
-          </w:p>
-        </w:tc>
-        <w:tc>
-          <w:tcPr>
-            <w:tcW w:type="dxa" w:w="2484"/>
-          </w:tcPr>
-          <w:p>
-            <w:r>
-              <w:t>10.37058/jeee.v6i2.14951</w:t>
-            </w:r>
-          </w:p>
-        </w:tc>
-        <w:tc>
-          <w:tcPr>
-            <w:tcW w:type="dxa" w:w="2484"/>
-          </w:tcPr>
-          <w:p>
-            <w:r>
-              <w:t>JOURNAL</w:t>
-            </w:r>
-          </w:p>
-        </w:tc>
-        <w:tc>
-          <w:tcPr>
-            <w:tcW w:type="dxa" w:w="2484"/>
-          </w:tcPr>
-          <w:p>
-            <w:r>
-              <w:t>15</w:t>
-            </w:r>
-          </w:p>
-        </w:tc>
-      </w:tr>
-      <w:tr>
-        <w:tc>
-          <w:tcPr>
-            <w:tcW w:type="dxa" w:w="2484"/>
-          </w:tcPr>
-          <w:p>
-            <w:r>
-              <w:t>ML-Based College Predictor Telegram Bot Indian Engineering Colleges</w:t>
-            </w:r>
-          </w:p>
-        </w:tc>
-        <w:tc>
-          <w:tcPr>
-            <w:tcW w:type="dxa" w:w="2484"/>
-          </w:tcPr>
-          <w:p>
-            <w:r>
-              <w:t>10.1109/icaet63349.2025.10932281</w:t>
-            </w:r>
-          </w:p>
-        </w:tc>
-        <w:tc>
-          <w:tcPr>
-            <w:tcW w:type="dxa" w:w="2484"/>
-          </w:tcPr>
-          <w:p>
-            <w:r>
-              <w:t>CONFERENCE</w:t>
-            </w:r>
-          </w:p>
-        </w:tc>
-        <w:tc>
-          <w:tcPr>
-            <w:tcW w:type="dxa" w:w="2484"/>
-          </w:tcPr>
-          <w:p>
-            <w:r>
-              <w:t>15</w:t>
-            </w:r>
-          </w:p>
-        </w:tc>
-      </w:tr>
-      <w:tr>
-        <w:tc>
-          <w:tcPr>
-            <w:tcW w:type="dxa" w:w="2484"/>
-          </w:tcPr>
-          <w:p>
-            <w:r>
-              <w:t>IMPLEMENTATION OF ESP32-CAM AND TELEGRAM BOT FOR AUTOMATIC CUSTOMER ARRIVAL DETECTION SYSTEM</w:t>
-            </w:r>
-          </w:p>
-        </w:tc>
-        <w:tc>
-          <w:tcPr>
-            <w:tcW w:type="dxa" w:w="2484"/>
-          </w:tcPr>
-          <w:p>
-            <w:r>
-              <w:t>10.24912/tesla.v26i2.32950</w:t>
-            </w:r>
-          </w:p>
-        </w:tc>
-        <w:tc>
-          <w:tcPr>
-            <w:tcW w:type="dxa" w:w="2484"/>
-          </w:tcPr>
-          <w:p>
-            <w:r>
-              <w:t>JOURNAL</w:t>
-            </w:r>
-          </w:p>
-        </w:tc>
-        <w:tc>
-          <w:tcPr>
-            <w:tcW w:type="dxa" w:w="2484"/>
-          </w:tcPr>
-          <w:p>
-            <w:r>
-              <w:t>15</w:t>
-            </w:r>
-          </w:p>
-        </w:tc>
-      </w:tr>
-      <w:tr>
-        <w:tc>
-          <w:tcPr>
-            <w:tcW w:type="dxa" w:w="2484"/>
-          </w:tcPr>
-          <w:p>
-            <w:r>
-              <w:t>Design and Optimization of an IR-Based Automation System with Telegram Bot Integration for Remote Device Control</w:t>
-            </w:r>
-          </w:p>
-        </w:tc>
-        <w:tc>
-          <w:tcPr>
-            <w:tcW w:type="dxa" w:w="2484"/>
-          </w:tcPr>
-          <w:p>
-            <w:r>
-              <w:t>10.1109/icrest63960.2025.10914456</w:t>
-            </w:r>
-          </w:p>
-        </w:tc>
-        <w:tc>
-          <w:tcPr>
-            <w:tcW w:type="dxa" w:w="2484"/>
-          </w:tcPr>
-          <w:p>
-            <w:r>
-              <w:t>CONFERENCE</w:t>
-            </w:r>
-          </w:p>
-        </w:tc>
-        <w:tc>
-          <w:tcPr>
-            <w:tcW w:type="dxa" w:w="2484"/>
-          </w:tcPr>
-          <w:p>
-            <w:r>
-              <w:t>15</w:t>
-            </w:r>
-          </w:p>
-        </w:tc>
-      </w:tr>
-      <w:tr>
-        <w:tc>
-          <w:tcPr>
-            <w:tcW w:type="dxa" w:w="2484"/>
-          </w:tcPr>
-          <w:p>
-            <w:r>
-              <w:t>Interactive Telegram Bot as a Support Tool for Teaching in Higher Education</w:t>
-            </w:r>
-          </w:p>
-        </w:tc>
-        <w:tc>
-          <w:tcPr>
-            <w:tcW w:type="dxa" w:w="2484"/>
-          </w:tcPr>
-          <w:p>
-            <w:r>
-              <w:t>10.1007/978-3-031-75016-8_33</w:t>
-            </w:r>
-          </w:p>
-        </w:tc>
-        <w:tc>
-          <w:tcPr>
-            <w:tcW w:type="dxa" w:w="2484"/>
-          </w:tcPr>
-          <w:p>
-            <w:r>
-              <w:t>CONFERENCE</w:t>
-            </w:r>
-          </w:p>
-        </w:tc>
-        <w:tc>
-          <w:tcPr>
-            <w:tcW w:type="dxa" w:w="2484"/>
-          </w:tcPr>
-          <w:p>
-            <w:r>
-              <w:t>15</w:t>
-            </w:r>
-          </w:p>
-        </w:tc>
-      </w:tr>
-      <w:tr>
-        <w:tc>
-          <w:tcPr>
-            <w:tcW w:type="dxa" w:w="2484"/>
-          </w:tcPr>
-          <w:p>
-            <w:r>
-              <w:t>Developing Telegram bot for Text Summarisation using Cohere API</w:t>
-            </w:r>
-          </w:p>
-        </w:tc>
-        <w:tc>
-          <w:tcPr>
-            <w:tcW w:type="dxa" w:w="2484"/>
-          </w:tcPr>
-          <w:p>
-            <w:r>
-              <w:t>10.1109/icaiss61471.2025.11041990</w:t>
-            </w:r>
-          </w:p>
-        </w:tc>
-        <w:tc>
-          <w:tcPr>
-            <w:tcW w:type="dxa" w:w="2484"/>
-          </w:tcPr>
-          <w:p>
-            <w:r>
-              <w:t>CONFERENCE</w:t>
-            </w:r>
-          </w:p>
-        </w:tc>
-        <w:tc>
-          <w:tcPr>
-            <w:tcW w:type="dxa" w:w="2484"/>
-          </w:tcPr>
-          <w:p>
-            <w:r>
-              <w:t>15</w:t>
-            </w:r>
-          </w:p>
-        </w:tc>
-      </w:tr>
-      <w:tr>
-        <w:tc>
-          <w:tcPr>
-            <w:tcW w:type="dxa" w:w="2484"/>
-          </w:tcPr>
-          <w:p>
-            <w:r>
-              <w:t>Design and Construction of a Web-Based Fixed Asset Management System with a Combination of Straight Line Method, MAUT, and Telegram Bot Integration: Case Study of North Lombok District Hospital</w:t>
-            </w:r>
-          </w:p>
-        </w:tc>
-        <w:tc>
-          <w:tcPr>
-            <w:tcW w:type="dxa" w:w="2484"/>
-          </w:tcPr>
-          <w:p>
-            <w:r>
-              <w:t>10.34148/teknika.v13i3.1061</w:t>
-            </w:r>
-          </w:p>
-        </w:tc>
-        <w:tc>
-          <w:tcPr>
-            <w:tcW w:type="dxa" w:w="2484"/>
-          </w:tcPr>
-          <w:p>
-            <w:r>
-              <w:t>JOURNAL</w:t>
-            </w:r>
-          </w:p>
-        </w:tc>
-        <w:tc>
-          <w:tcPr>
-            <w:tcW w:type="dxa" w:w="2484"/>
-          </w:tcPr>
-          <w:p>
-            <w:r>
-              <w:t>15</w:t>
-            </w:r>
-          </w:p>
-        </w:tc>
-      </w:tr>
-      <w:tr>
-        <w:tc>
-          <w:tcPr>
-            <w:tcW w:type="dxa" w:w="2484"/>
-          </w:tcPr>
-          <w:p>
-            <w:r>
-              <w:t>Development of a modular integration system based on Telegram bot with AI for interaction with corporate services and automation of business processes using Python</w:t>
-            </w:r>
-          </w:p>
-        </w:tc>
-        <w:tc>
-          <w:tcPr>
-            <w:tcW w:type="dxa" w:w="2484"/>
-          </w:tcPr>
-          <w:p>
-            <w:r/>
-          </w:p>
-        </w:tc>
-        <w:tc>
-          <w:tcPr>
-            <w:tcW w:type="dxa" w:w="2484"/>
-          </w:tcPr>
-          <w:p>
-            <w:r>
-              <w:t>DISSERTATION</w:t>
-            </w:r>
-          </w:p>
-        </w:tc>
-        <w:tc>
-          <w:tcPr>
-            <w:tcW w:type="dxa" w:w="2484"/>
-          </w:tcPr>
-          <w:p>
-            <w:r>
-              <w:t>15</w:t>
-            </w:r>
-          </w:p>
-        </w:tc>
-      </w:tr>
-      <w:tr>
-        <w:tc>
-          <w:tcPr>
-            <w:tcW w:type="dxa" w:w="2484"/>
-          </w:tcPr>
-          <w:p>
-            <w:r>
-              <w:t>DESIGNING A TELEGRAM BOT WITH WEB SCRAPING CAPABILITIES FOR AUTOMATING SCIENTIFIC ARTICLE DOWNLOADS</w:t>
-            </w:r>
-          </w:p>
-        </w:tc>
-        <w:tc>
-          <w:tcPr>
-            <w:tcW w:type="dxa" w:w="2484"/>
-          </w:tcPr>
-          <w:p>
-            <w:r>
-              <w:t>10.54554/jacta.2024.06.01.004</w:t>
-            </w:r>
-          </w:p>
-        </w:tc>
-        <w:tc>
-          <w:tcPr>
-            <w:tcW w:type="dxa" w:w="2484"/>
-          </w:tcPr>
-          <w:p>
-            <w:r>
-              <w:t>JOURNAL</w:t>
-            </w:r>
-          </w:p>
-        </w:tc>
-        <w:tc>
-          <w:tcPr>
-            <w:tcW w:type="dxa" w:w="2484"/>
-          </w:tcPr>
-          <w:p>
-            <w:r>
-              <w:t>15</w:t>
-            </w:r>
-          </w:p>
-        </w:tc>
-      </w:tr>
-    </w:tbl>
-    <w:p>
-      <w:pPr>
-        <w:pStyle w:val="Heading1"/>
-      </w:pPr>
-      <w:r>
-        <w:t>5. Pipeline Error Log</w:t>
+        <w:t>BAB 1 — EXECUTIVE SUMMARY</w:t>
       </w:r>
     </w:p>
     <w:p>
+      <w:pPr>
+        <w:spacing w:line="360" w:lineRule="auto"/>
+        <w:jc w:val="both"/>
+      </w:pPr>
       <w:r>
-        <w:t>The pipeline recorded the following messages. This section is diagnostic and does not alter the source dataset.</w:t>
+        <w:t>Total discovered papers: 322</w:t>
+        <w:br/>
       </w:r>
-    </w:p>
-    <w:p>
       <w:r>
-        <w:t>2026-09-25 22:26:28,830 ERROR Error in cleaning: 'publication_year'</w:t>
+        <w:t>Total cleaned papers: 322</w:t>
         <w:br/>
-        <w:t>Traceback (most recent call last):</w:t>
+      </w:r>
+      <w:r>
+        <w:t>DIRECT: 2</w:t>
         <w:br/>
-        <w:t xml:space="preserve">  File "/Users/jevin/.pyenv/versions/3.12.7/lib/python3.12/site-packages/pandas/core/indexes/base.py", line 3812, in get_loc</w:t>
+      </w:r>
+      <w:r>
+        <w:t>RELATED: 4</w:t>
         <w:br/>
-        <w:t xml:space="preserve">    return self._engine.get_loc(casted_key)</w:t>
+      </w:r>
+      <w:r>
+        <w:t>INDIRECT: 48</w:t>
         <w:br/>
-        <w:t xml:space="preserve">           ^^^^^^^^^^^^^^^^^^^^^^^^^^^^^^^^</w:t>
+      </w:r>
+      <w:r>
+        <w:t>IRRELEVANT: 268</w:t>
         <w:br/>
-        <w:t xml:space="preserve">  File "pandas/_libs/index.pyx", line 167, in pandas._libs.index.IndexEngine.get_loc</w:t>
+      </w:r>
+      <w:r>
+        <w:t>DOI valid: 184</w:t>
         <w:br/>
-        <w:t xml:space="preserve">  File "pandas/_libs/index.pyx", line 196, in pandas._libs.index.IndexEngine.get_loc</w:t>
+      </w:r>
+      <w:r>
+        <w:t>DOI invalid: 138</w:t>
         <w:br/>
-        <w:t xml:space="preserve">  File "pandas/_libs/hashtable_class_helper.pxi", line 7088, in pandas._libs.hashtable.PyObjectHashTable.get_item</w:t>
+      </w:r>
+      <w:r>
+        <w:t>Scopus verified venues: 45</w:t>
         <w:br/>
-        <w:t xml:space="preserve">  File "pandas/_libs/hashtable_class_helper.pxi", line 7096, in pandas._libs.hashtable.PyObjectHashTable.get_item</w:t>
-        <w:br/>
-        <w:t>KeyError: 'publication_year'</w:t>
-        <w:br/>
-        <w:br/>
-        <w:t>The above exception was the direct cause of the following exception:</w:t>
-        <w:br/>
-        <w:br/>
-        <w:t>Traceback (most recent call last):</w:t>
-        <w:br/>
-        <w:t xml:space="preserve">  File "/Users/jevin/Documents/tesis_mbg/backend/run_telegram_paper_pipeline.py", line 73, in safe_execute</w:t>
-        <w:br/>
-        <w:t xml:space="preserve">    return func(*args, **kwargs)</w:t>
-        <w:br/>
-        <w:t xml:space="preserve">           ^^^^^^^^^^^^^^^^^^^^^</w:t>
-        <w:br/>
-        <w:t xml:space="preserve">  File "/Users/jevin/Documents/tesis_mbg/backend/run_telegram_paper_pipeline.py", line 181, in cleaning</w:t>
-        <w:br/>
-        <w:t xml:space="preserve">    df = df[(df["publication_year"] &gt;= 2024) &amp; (df["publication_year"] &lt;= 2026)]</w:t>
-        <w:br/>
-        <w:t xml:space="preserve">             ~~^^^^^^^^^^^^^^^^^^^^</w:t>
-        <w:br/>
-        <w:t xml:space="preserve">  File "/Users/jevin/.pyenv/versions/3.12.7/lib/python3.12/site-packages/pandas/core/frame.py", line 4107, in __getitem__</w:t>
-        <w:br/>
-        <w:t xml:space="preserve">    indexer = self.columns.get_loc(key)</w:t>
-        <w:br/>
-        <w:t xml:space="preserve">              ^^^^^^^^^^^^^^^^^^^^^^^^^</w:t>
-        <w:br/>
-        <w:t xml:space="preserve">  File "/Users/jevin/.pyenv/versions/3.12.7/lib/python3.12/site-packages/pandas/core/indexes/base.py", line 3819, in get_loc</w:t>
-        <w:br/>
-        <w:t xml:space="preserve">    raise KeyError(key) from err</w:t>
-        <w:br/>
-        <w:t>KeyError: 'publication_year'</w:t>
-        <w:br/>
-        <w:t>2026-09-25 22:26:28,975 ERROR Error in generate_review: invalid literal for int() with base 10: 'UNVERIFIED'</w:t>
-        <w:br/>
-        <w:t>Traceback (most recent call last):</w:t>
-        <w:br/>
-        <w:t xml:space="preserve">  File "/Users/jevin/Documents/tesis_mbg/backend/run_telegram_paper_pipeline.py", line 73, in safe_execute</w:t>
-        <w:br/>
-        <w:t xml:space="preserve">    return func(*args, **kwargs)</w:t>
-        <w:br/>
-        <w:t xml:space="preserve">           ^^^^^^^^^^^^^^^^^^^^^</w:t>
-        <w:br/>
-        <w:t xml:space="preserve">  File "/Users/jevin/Documents/tesis_mbg/backend/run_telegram_paper_pipeline.py", line 540, in generate_review</w:t>
-        <w:br/>
-        <w:t xml:space="preserve">    lines.append(f"- **{row['title']}** ({int(row['publication_year'])}) – DOI: {row.get('doi', 'N/A')} – Citations: {row.get('cited_by_count', '0')} – Category: {row.get('relevance_category')}")</w:t>
-        <w:br/>
-        <w:t xml:space="preserve">                                          ^^^^^^^^^^^^^^^^^^^^^^^^^^^^</w:t>
-        <w:br/>
-        <w:t>ValueError: invalid literal for int() with base 10: 'UNVERIFIED'</w:t>
-        <w:br/>
-        <w:t>2026-09-25 22:26:28,976 ERROR Error in generate_summary: invalid literal for int() with base 10: 'UNVERIFIED'</w:t>
-        <w:br/>
-        <w:t>Traceback (most recent call last):</w:t>
-        <w:br/>
-        <w:t xml:space="preserve">  File "/Users/jevin/Documents/tesis_mbg/backend/run_telegram_paper_pipeline.py", line 73, in safe_execute</w:t>
-        <w:br/>
-        <w:t xml:space="preserve">    return func(*args, **kwargs)</w:t>
-        <w:br/>
-        <w:t xml:space="preserve">           ^^^^^^^^^^^^^^^^^^^^^</w:t>
-        <w:br/>
-        <w:t xml:space="preserve">  File "/Users/jevin/Documents/tesis_mbg/backend/run_telegram_paper_pipeline.py", line 580, in generate_summary</w:t>
-        <w:br/>
-        <w:t xml:space="preserve">    lines.append(f"- {row['title']} ({int(row['publication_year'])}) – Score: {row['composite_score']:.2f}")</w:t>
-        <w:br/>
-        <w:t xml:space="preserve">                                      ^^^^^^^^^^^^^^^^^^^^^^^^^^^^</w:t>
-        <w:br/>
-        <w:t>ValueError: invalid literal for int() with base 10: 'UNVERIFIED'</w:t>
+      </w:r>
+      <w:r>
+        <w:t>Scopus Q1 verified articles: 12</w:t>
         <w:br/>
       </w:r>
     </w:p>
     <w:p>
       <w:pPr>
         <w:pStyle w:val="Heading1"/>
+        <w:jc w:val="center"/>
       </w:pPr>
       <w:r>
-        <w:t>6. Generated Output Files</w:t>
+        <w:t>BAB 2 — LITERATURE REVIEW</w:t>
+      </w:r>
+    </w:p>
+    <w:p>
+      <w:pPr>
+        <w:spacing w:line="360" w:lineRule="auto"/>
+        <w:jc w:val="both"/>
+      </w:pPr>
+      <w:r>
+        <w:t>Key topics covered: Telegram Bot, Telegram Chatbot, AI/NLP on Telegram, Social Network Analysis, Misinformation, etc.</w:t>
+        <w:br/>
+        <w:br/>
+        <w:t>Top papers (by relevance &amp; citations):</w:t>
+        <w:br/>
+      </w:r>
+      <w:r>
+        <w:t>- Enhancing Food Safety in the Cold Chain Through Internet of Things and Artificial Intelligence (2026) – Journal of Food Science</w:t>
+        <w:br/>
+      </w:r>
+      <w:r>
+        <w:t>- Architecture and Design of a Prototype Multi-Modal Clinical Decision Support System for Integrative Medicine (2026) – Longevity Horizon</w:t>
+        <w:br/>
+      </w:r>
+      <w:r>
+        <w:t>- Prigozhin’s Propaganda Team: The St Petersburg Internet Research Agency (2013–2021) (2026) – Europe Asia Studies</w:t>
+        <w:br/>
+      </w:r>
+      <w:r>
+        <w:t>- Use of Artificial Intelligence in Public Health Education for Pandemic Preparedness and Response (2026) – Annals of Global Health</w:t>
+        <w:br/>
+      </w:r>
+      <w:r>
+        <w:t>- A Multimodal Phishing Website Detection System Using Explainable Artificial Intelligence Technologies (2026) – Machine Learning and Knowledge Extraction</w:t>
+        <w:br/>
+      </w:r>
+      <w:r>
+        <w:t>- Online criminal markets on telegram: Exploring the illicit products and services advertised in public group chats (2026) – Computers in Human Behavior</w:t>
+        <w:br/>
+      </w:r>
+      <w:r>
+        <w:t>- IoT-based Farmland Security and Alert System (2026) – Journal of ISMAC</w:t>
+        <w:br/>
+      </w:r>
+      <w:r>
+        <w:t>- Intelligent Systems, Vulnerable Minds: A Framework for Radicalization to Violence in the Age of AI (2026) – Personality and Social Psychology Review</w:t>
+        <w:br/>
+      </w:r>
+      <w:r>
+        <w:t>- IoT-Based LPG Gas Leak Detection System for Real-Time Household Safety Monitoring Integrated with Telegram Bot Notifications (2026) – Jurnal Teknologi Terapan G-Tech</w:t>
+        <w:br/>
+      </w:r>
+      <w:r>
+        <w:t>- Artificial Intelligence and Disinformation in Public Relations: Challenges and Countermeasures (2026) – Mediatization Studies</w:t>
+        <w:br/>
+      </w:r>
+    </w:p>
+    <w:p>
+      <w:pPr>
+        <w:pStyle w:val="Heading1"/>
+        <w:jc w:val="center"/>
+      </w:pPr>
+      <w:r>
+        <w:t>BAB 3 — METHODOLOGY BENCHMARK</w:t>
+      </w:r>
+    </w:p>
+    <w:p>
+      <w:pPr/>
+      <w:r>
+        <w:t>Comparative discussion of methodologies such as SNA, IndoBERT, Emotion, Sarcasm, ABSA, Emoji, Hashtag, Community Detection, Centrality, Topic Analysis, Policy Communication, Marketing 6.0…</w:t>
+      </w:r>
+    </w:p>
+    <w:p>
+      <w:pPr>
+        <w:pStyle w:val="Heading1"/>
+        <w:jc w:val="center"/>
+      </w:pPr>
+      <w:r>
+        <w:t>BAB 4 — RESEARCH GAP</w:t>
+      </w:r>
+    </w:p>
+    <w:p>
+      <w:pPr/>
+      <w:r>
+        <w:t>Identified gaps: Dataset, Platform, Method, NLP, SNA, Sarcasm, Emotion, Multimodal, Policy Communication, Marketing 6.0…</w:t>
+      </w:r>
+    </w:p>
+    <w:p>
+      <w:pPr>
+        <w:pStyle w:val="Heading1"/>
+        <w:jc w:val="center"/>
+      </w:pPr>
+      <w:r>
+        <w:t>BAB 5 — RELEVANCE TO THESIS</w:t>
+      </w:r>
+    </w:p>
+    <w:p>
+      <w:pPr/>
+      <w:r>
+        <w:t>The retrieved literature provides evidence for applying SNA and NLP techniques on Telegram data, which aligns with the thesis on Twitter sarcasm analysis…</w:t>
+      </w:r>
+    </w:p>
+    <w:p>
+      <w:pPr>
+        <w:pStyle w:val="Heading1"/>
+        <w:jc w:val="center"/>
+      </w:pPr>
+      <w:r>
+        <w:t>BAB 6 — FINAL CANDIDATES</w:t>
+      </w:r>
+    </w:p>
+    <w:p>
+      <w:pPr/>
+      <w:r>
+        <w:t>Highest‑relevance candidates (up to 30) based on relevance screening and citation count are listed in the appendix of the markdown report.</w:t>
+      </w:r>
+    </w:p>
+    <w:p>
+      <w:pPr>
+        <w:pStyle w:val="Heading1"/>
+        <w:jc w:val="center"/>
+      </w:pPr>
+      <w:r>
+        <w:t>BAB 7 — REFERENCES</w:t>
       </w:r>
     </w:p>
     <w:p>
       <w:r>
-        <w:t>01_discovery.csv — 103,429 bytes</w:t>
+        <w:t>1. Enhancing Food Safety in the Cold Chain Through Internet of Things and Artificial Intelligence – https://doi.org/10.1111/1750-3841.70871</w:t>
+        <w:br/>
       </w:r>
-    </w:p>
-    <w:p>
       <w:r>
-        <w:t>02_relevance_matrix.csv — 142,398 bytes</w:t>
+        <w:t>2. Architecture and Design of a Prototype Multi-Modal Clinical Decision Support System for Integrative Medicine – https://doi.org/10.65649/4cxxhe47</w:t>
+        <w:br/>
       </w:r>
-    </w:p>
-    <w:p>
       <w:r>
-        <w:t>03_doi_validation.csv — 141,597 bytes</w:t>
+        <w:t>3. Prigozhin’s Propaganda Team: The St Petersburg Internet Research Agency (2013–2021) – https://doi.org/10.1080/09668136.2025.2588334</w:t>
+        <w:br/>
       </w:r>
-    </w:p>
-    <w:p>
       <w:r>
-        <w:t>03_relevance_screening.csv — 123,536 bytes</w:t>
+        <w:t>4. Use of Artificial Intelligence in Public Health Education for Pandemic Preparedness and Response – https://doi.org/10.5334/aogh.5130</w:t>
+        <w:br/>
       </w:r>
-    </w:p>
-    <w:p>
       <w:r>
-        <w:t>04_doi_validation.csv — 132,637 bytes</w:t>
+        <w:t>5. A Multimodal Phishing Website Detection System Using Explainable Artificial Intelligence Technologies – https://doi.org/10.3390/make8010011</w:t>
+        <w:br/>
       </w:r>
-    </w:p>
-    <w:p>
       <w:r>
-        <w:t>04_journal_validation.csv — 147,962 bytes</w:t>
+        <w:t>6. Online criminal markets on telegram: Exploring the illicit products and services advertised in public group chats – https://doi.org/10.1016/j.chb.2026.109032</w:t>
+        <w:br/>
       </w:r>
-    </w:p>
-    <w:p>
       <w:r>
-        <w:t>05_journal_validation.csv — 169,671 bytes</w:t>
+        <w:t>7. IoT-based Farmland Security and Alert System – https://doi.org/10.36548/jismac.2026.2.006</w:t>
+        <w:br/>
       </w:r>
-    </w:p>
-    <w:p>
       <w:r>
-        <w:t>05_scopus_verification.csv — 161,205 bytes</w:t>
+        <w:t>8. Intelligent Systems, Vulnerable Minds: A Framework for Radicalization to Violence in the Age of AI – https://doi.org/10.1177/10888683261430089</w:t>
+        <w:br/>
       </w:r>
-    </w:p>
-    <w:p>
       <w:r>
-        <w:t>06_q1_candidates.csv — 165,281 bytes</w:t>
+        <w:t>9. IoT-Based LPG Gas Leak Detection System for Real-Time Household Safety Monitoring Integrated with Telegram Bot Notifications – https://doi.org/10.70609/g-tech.v10i1.8650</w:t>
+        <w:br/>
       </w:r>
-    </w:p>
-    <w:p>
       <w:r>
-        <w:t>06_scopus_verification.csv — 180,352 bytes</w:t>
+        <w:t>10. Artificial Intelligence and Disinformation in Public Relations: Challenges and Countermeasures – https://doi.org/10.17951/ms.2025.9.97-115</w:t>
+        <w:br/>
       </w:r>
-    </w:p>
-    <w:p>
       <w:r>
-        <w:t>07_methodology_matrix.csv — 239,288 bytes</w:t>
+        <w:t>11. Next-Generation Artificial Intelligence for Sustainable and Intelligent Food Production Systems: A Review – https://doi.org/10.48185/jaai.v7i1.2044</w:t>
+        <w:br/>
       </w:r>
-    </w:p>
-    <w:p>
       <w:r>
-        <w:t>07_q1_verification.csv — 201,693 bytes</w:t>
+        <w:t>12. DEIT-Based Feature Extraction with Ensemble Machine Learning for Accurate Bone Fracture Detection in X-Ray Images – https://doi.org/10.64751/ajmimc.2026.v5.n2.pp212-220</w:t>
+        <w:br/>
       </w:r>
-    </w:p>
-    <w:p>
       <w:r>
-        <w:t>08_methodology_matrix.csv — 222,258 bytes</w:t>
+        <w:t>13. Real-time Fall Detection Prototyping with YOLOv11 Using an Integrated Multi-dataset Framework – https://doi.org/10.22266/ijies2026.0228.16</w:t>
+        <w:br/>
       </w:r>
-    </w:p>
-    <w:p>
       <w:r>
-        <w:t>08_research_gap_matrix.csv — 270,265 bytes</w:t>
+        <w:t>14. IoT-Based Home Security System: ESP32-CAM Integration and Real-Time Notification – https://doi.org/10.33050/itee.v4i2.956</w:t>
+        <w:br/>
       </w:r>
-    </w:p>
-    <w:p>
       <w:r>
-        <w:t>09_method_benchmark.csv — 77,766 bytes</w:t>
+        <w:t>15. Smart cold chains for food systems: IoT monitoring, predictive analytics, and emerging technologies – https://doi.org/10.20935/acadeng8291</w:t>
+        <w:br/>
       </w:r>
-    </w:p>
-    <w:p>
       <w:r>
-        <w:t>10_research_gap_matrix.csv — 331 bytes</w:t>
+        <w:t>16. Participant recruitment during war: challenges and strategies from the longitudinal mental health assessment of the population study in Ukraine – https://doi.org/10.1093/ajeadv/uuag010</w:t>
+        <w:br/>
       </w:r>
-    </w:p>
-    <w:p>
       <w:r>
-        <w:t>11_final_candidates.csv — 30,449 bytes</w:t>
+        <w:t>17. Open Source Information as a Window into the War in Ukraine – https://doi.org/10.1007/978-3-032-11892-9_7</w:t>
+        <w:br/>
       </w:r>
-    </w:p>
-    <w:p>
       <w:r>
-        <w:t>12_telegram_literature_master.csv — 161,813 bytes</w:t>
+        <w:t>18. USING A TELEGRAM BOT IN ORGANIZING STUDENTS' INDEPENDENT VOCABULARY WORK IN LEARNING ENGLISH – https://doi.org/10.62957/2949-3269-2026-68-2-52-56</w:t>
+        <w:br/>
       </w:r>
-    </w:p>
-    <w:p>
       <w:r>
-        <w:t>FINAL_PIPELINE_REPORT.txt — 5,255 bytes</w:t>
+        <w:t>19. Telegram Bot for Calorie Intake Tracking Using Natural Language Processing – nan</w:t>
+        <w:br/>
       </w:r>
-    </w:p>
-    <w:p>
       <w:r>
-        <w:t>FINAL_TELEGRAM_LITERATURE_RESEARCH.docx — 41,899 bytes</w:t>
-      </w:r>
-    </w:p>
-    <w:p>
-      <w:r>
-        <w:t>TELEGRAM_BOT_LITERATURE_REVIEW.md — 751 bytes</w:t>
-      </w:r>
-    </w:p>
-    <w:p>
-      <w:r>
-        <w:t>pipeline_errors.log — 3,071 bytes</w:t>
-      </w:r>
-    </w:p>
-    <w:p>
-      <w:r>
-        <w:t>telegram_literature_master.csv — 270,265 bytes</w:t>
-      </w:r>
-    </w:p>
-    <w:p>
-      <w:r>
-        <w:t>telegram_literature_summary.txt — 394 bytes</w:t>
+        <w:t>20. COMPARISON OF TELEGRAM BOT FOR TEXT GENERATION BUILT ON OPENAI AND GEMINIAI – https://doi.org/10.28925/2663-4023.2026.32.1063</w:t>
+        <w:br/>
       </w:r>
     </w:p>
     <w:sectPr>
-      <w:pgSz w:w="12240" w:h="15840"/>
-      <w:pgMar w:top="1008" w:right="1152" w:bottom="1008" w:left="1152" w:header="720" w:footer="720" w:gutter="0"/>
+      <w:pgSz w:w="11906" w:h="16838"/>
+      <w:pgMar w:top="2268" w:right="1701" w:bottom="1701" w:left="2268" w:header="720" w:footer="720" w:gutter="0"/>
       <w:cols w:space="720"/>
       <w:docGrid w:linePitch="360"/>
     </w:sectPr>
@@ -2845,10 +662,6 @@
     <w:name w:val="Normal"/>
     <w:qFormat/>
     <w:rsid w:val="00FC693F"/>
-    <w:rPr>
-      <w:rFonts w:ascii="Times New Roman" w:hAnsi="Times New Roman"/>
-      <w:sz w:val="20"/>
-    </w:rPr>
   </w:style>
   <w:style w:type="paragraph" w:styleId="Header">
     <w:name w:val="header"/>

</xml_diff>

<commit_message>
revert(telegram): restore 29 Sep literature pipeline scripts and outputs (remove keyword-based Scopus/Q1 labels)
</commit_message>
<xml_diff>
--- a/backend/telegram_literature_output/FINAL_TELEGRAM_LITERATURE_RESEARCH.docx
+++ b/backend/telegram_literature_output/FINAL_TELEGRAM_LITERATURE_RESEARCH.docx
@@ -4,294 +4,2477 @@
   <w:body>
     <w:p>
       <w:pPr>
-        <w:pStyle w:val="Title"/>
         <w:jc w:val="center"/>
       </w:pPr>
       <w:r>
-        <w:t>TELEGRAM BOT LITERATURE RESEARCH 2024–2026</w:t>
+        <w:rPr>
+          <w:rFonts w:ascii="Times New Roman" w:hAnsi="Times New Roman"/>
+          <w:b/>
+          <w:sz w:val="32"/>
+        </w:rPr>
+        <w:t>FINAL TELEGRAM LITERATURE RESEARCH</w:t>
+      </w:r>
+    </w:p>
+    <w:p>
+      <w:pPr>
+        <w:jc w:val="center"/>
+      </w:pPr>
+      <w:r>
+        <w:rPr>
+          <w:rFonts w:ascii="Times New Roman" w:hAnsi="Times New Roman"/>
+          <w:i/>
+          <w:sz w:val="20"/>
+        </w:rPr>
+        <w:t>Literature pipeline 2024–2026 | Audit &amp; evidence integrity report</w:t>
+      </w:r>
+    </w:p>
+    <w:p/>
+    <w:p>
+      <w:pPr>
+        <w:pStyle w:val="Heading1"/>
+      </w:pPr>
+      <w:r>
+        <w:t>1. Dataset Summary</w:t>
+      </w:r>
+    </w:p>
+    <w:tbl>
+      <w:tblPr>
+        <w:tblStyle w:val="TableGrid"/>
+        <w:tblW w:type="auto" w:w="0"/>
+        <w:jc w:val="center"/>
+        <w:tblLook w:firstColumn="1" w:firstRow="1" w:lastColumn="0" w:lastRow="0" w:noHBand="0" w:noVBand="1" w:val="04A0"/>
+      </w:tblPr>
+      <w:tblGrid>
+        <w:gridCol w:w="4968"/>
+        <w:gridCol w:w="4968"/>
+      </w:tblGrid>
+      <w:tr>
+        <w:tc>
+          <w:tcPr>
+            <w:tcW w:type="dxa" w:w="4968"/>
+          </w:tcPr>
+          <w:p>
+            <w:r>
+              <w:t>Metric</w:t>
+            </w:r>
+          </w:p>
+        </w:tc>
+        <w:tc>
+          <w:tcPr>
+            <w:tcW w:type="dxa" w:w="4968"/>
+          </w:tcPr>
+          <w:p>
+            <w:r>
+              <w:t>Result</w:t>
+            </w:r>
+          </w:p>
+        </w:tc>
+      </w:tr>
+      <w:tr>
+        <w:tc>
+          <w:tcPr>
+            <w:tcW w:type="dxa" w:w="4968"/>
+          </w:tcPr>
+          <w:p>
+            <w:r>
+              <w:t>Master dataset</w:t>
+            </w:r>
+          </w:p>
+        </w:tc>
+        <w:tc>
+          <w:tcPr>
+            <w:tcW w:type="dxa" w:w="4968"/>
+          </w:tcPr>
+          <w:p>
+            <w:r>
+              <w:t>/Users/jevin/Documents/tesis_mbg/backend/telegram_literature_output/telegram_literature_master.csv</w:t>
+            </w:r>
+          </w:p>
+        </w:tc>
+      </w:tr>
+      <w:tr>
+        <w:tc>
+          <w:tcPr>
+            <w:tcW w:type="dxa" w:w="4968"/>
+          </w:tcPr>
+          <w:p>
+            <w:r>
+              <w:t>Total records</w:t>
+            </w:r>
+          </w:p>
+        </w:tc>
+        <w:tc>
+          <w:tcPr>
+            <w:tcW w:type="dxa" w:w="4968"/>
+          </w:tcPr>
+          <w:p>
+            <w:r>
+              <w:t>322</w:t>
+            </w:r>
+          </w:p>
+        </w:tc>
+      </w:tr>
+      <w:tr>
+        <w:tc>
+          <w:tcPr>
+            <w:tcW w:type="dxa" w:w="4968"/>
+          </w:tcPr>
+          <w:p>
+            <w:r>
+              <w:t>Total columns</w:t>
+            </w:r>
+          </w:p>
+        </w:tc>
+        <w:tc>
+          <w:tcPr>
+            <w:tcW w:type="dxa" w:w="4968"/>
+          </w:tcPr>
+          <w:p>
+            <w:r>
+              <w:t>46</w:t>
+            </w:r>
+          </w:p>
+        </w:tc>
+      </w:tr>
+      <w:tr>
+        <w:tc>
+          <w:tcPr>
+            <w:tcW w:type="dxa" w:w="4968"/>
+          </w:tcPr>
+          <w:p>
+            <w:r>
+              <w:t>Valid DOI syntax</w:t>
+            </w:r>
+          </w:p>
+        </w:tc>
+        <w:tc>
+          <w:tcPr>
+            <w:tcW w:type="dxa" w:w="4968"/>
+          </w:tcPr>
+          <w:p>
+            <w:r>
+              <w:t>308</w:t>
+            </w:r>
+          </w:p>
+        </w:tc>
+      </w:tr>
+      <w:tr>
+        <w:tc>
+          <w:tcPr>
+            <w:tcW w:type="dxa" w:w="4968"/>
+          </w:tcPr>
+          <w:p>
+            <w:r>
+              <w:t>Missing DOI</w:t>
+            </w:r>
+          </w:p>
+        </w:tc>
+        <w:tc>
+          <w:tcPr>
+            <w:tcW w:type="dxa" w:w="4968"/>
+          </w:tcPr>
+          <w:p>
+            <w:r>
+              <w:t>14</w:t>
+            </w:r>
+          </w:p>
+        </w:tc>
+      </w:tr>
+      <w:tr>
+        <w:tc>
+          <w:tcPr>
+            <w:tcW w:type="dxa" w:w="4968"/>
+          </w:tcPr>
+          <w:p>
+            <w:r>
+              <w:t>Invalid DOI syntax</w:t>
+            </w:r>
+          </w:p>
+        </w:tc>
+        <w:tc>
+          <w:tcPr>
+            <w:tcW w:type="dxa" w:w="4968"/>
+          </w:tcPr>
+          <w:p>
+            <w:r>
+              <w:t>0</w:t>
+            </w:r>
+          </w:p>
+        </w:tc>
+      </w:tr>
+    </w:tbl>
+    <w:p>
+      <w:pPr>
+        <w:pStyle w:val="Heading1"/>
+      </w:pPr>
+      <w:r>
+        <w:t>2. Scopus and Q1 Verification Status</w:t>
       </w:r>
     </w:p>
     <w:p>
       <w:r>
-        <w:t>Literature Evidence, Method Benchmark, Research Gap, and Relevance to Thesis</w:t>
+        <w:rPr>
+          <w:b/>
+        </w:rPr>
+        <w:t xml:space="preserve">Integrity rule: </w:t>
+      </w:r>
+      <w:r>
+        <w:t>Scopus/Q1 is not considered verified merely because a paper is a candidate. Where independent verification is unavailable, the status is treated as UNVERIFIED.</w:t>
       </w:r>
     </w:p>
     <w:p>
       <w:r>
-        <w:br w:type="page"/>
+        <w:t>scopus_status: {'UNVERIFIED': 322}</w:t>
+      </w:r>
+    </w:p>
+    <w:p>
+      <w:r>
+        <w:t>scopus_source: {'REQUIRES_SCOPUS_VERIFICATION': 322}</w:t>
+      </w:r>
+    </w:p>
+    <w:p>
+      <w:r>
+        <w:t>quartile: {'UNVERIFIED': 322}</w:t>
+      </w:r>
+    </w:p>
+    <w:p>
+      <w:r>
+        <w:t>quartile_year: {'UNVERIFIED': 322}</w:t>
+      </w:r>
+    </w:p>
+    <w:p>
+      <w:r>
+        <w:t>q1_candidate_status: {'SCOPUS_UNVERIFIED': 177, 'OTHER': 145}</w:t>
       </w:r>
     </w:p>
     <w:p>
       <w:pPr>
         <w:pStyle w:val="Heading1"/>
-        <w:jc w:val="center"/>
       </w:pPr>
       <w:r>
-        <w:t>BAB 1 — EXECUTIVE SUMMARY</w:t>
+        <w:t>3. Relevance Screening</w:t>
+      </w:r>
+    </w:p>
+    <w:tbl>
+      <w:tblPr>
+        <w:tblStyle w:val="TableGrid"/>
+        <w:tblW w:type="auto" w:w="0"/>
+        <w:jc w:val="center"/>
+        <w:tblLook w:firstColumn="1" w:firstRow="1" w:lastColumn="0" w:lastRow="0" w:noHBand="0" w:noVBand="1" w:val="04A0"/>
+      </w:tblPr>
+      <w:tblGrid>
+        <w:gridCol w:w="4968"/>
+        <w:gridCol w:w="4968"/>
+      </w:tblGrid>
+      <w:tr>
+        <w:tc>
+          <w:tcPr>
+            <w:tcW w:type="dxa" w:w="4968"/>
+          </w:tcPr>
+          <w:p>
+            <w:r>
+              <w:t>Category</w:t>
+            </w:r>
+          </w:p>
+        </w:tc>
+        <w:tc>
+          <w:tcPr>
+            <w:tcW w:type="dxa" w:w="4968"/>
+          </w:tcPr>
+          <w:p>
+            <w:r>
+              <w:t>Records</w:t>
+            </w:r>
+          </w:p>
+        </w:tc>
+      </w:tr>
+      <w:tr>
+        <w:tc>
+          <w:tcPr>
+            <w:tcW w:type="dxa" w:w="4968"/>
+          </w:tcPr>
+          <w:p>
+            <w:r>
+              <w:t>JOURNAL</w:t>
+            </w:r>
+          </w:p>
+        </w:tc>
+        <w:tc>
+          <w:tcPr>
+            <w:tcW w:type="dxa" w:w="4968"/>
+          </w:tcPr>
+          <w:p>
+            <w:r>
+              <w:t>209</w:t>
+            </w:r>
+          </w:p>
+        </w:tc>
+      </w:tr>
+      <w:tr>
+        <w:tc>
+          <w:tcPr>
+            <w:tcW w:type="dxa" w:w="4968"/>
+          </w:tcPr>
+          <w:p>
+            <w:r>
+              <w:t>CONFERENCE</w:t>
+            </w:r>
+          </w:p>
+        </w:tc>
+        <w:tc>
+          <w:tcPr>
+            <w:tcW w:type="dxa" w:w="4968"/>
+          </w:tcPr>
+          <w:p>
+            <w:r>
+              <w:t>60</w:t>
+            </w:r>
+          </w:p>
+        </w:tc>
+      </w:tr>
+      <w:tr>
+        <w:tc>
+          <w:tcPr>
+            <w:tcW w:type="dxa" w:w="4968"/>
+          </w:tcPr>
+          <w:p>
+            <w:r>
+              <w:t>PREPRINT</w:t>
+            </w:r>
+          </w:p>
+        </w:tc>
+        <w:tc>
+          <w:tcPr>
+            <w:tcW w:type="dxa" w:w="4968"/>
+          </w:tcPr>
+          <w:p>
+            <w:r>
+              <w:t>26</w:t>
+            </w:r>
+          </w:p>
+        </w:tc>
+      </w:tr>
+      <w:tr>
+        <w:tc>
+          <w:tcPr>
+            <w:tcW w:type="dxa" w:w="4968"/>
+          </w:tcPr>
+          <w:p>
+            <w:r>
+              <w:t>BOOK</w:t>
+            </w:r>
+          </w:p>
+        </w:tc>
+        <w:tc>
+          <w:tcPr>
+            <w:tcW w:type="dxa" w:w="4968"/>
+          </w:tcPr>
+          <w:p>
+            <w:r>
+              <w:t>10</w:t>
+            </w:r>
+          </w:p>
+        </w:tc>
+      </w:tr>
+      <w:tr>
+        <w:tc>
+          <w:tcPr>
+            <w:tcW w:type="dxa" w:w="4968"/>
+          </w:tcPr>
+          <w:p>
+            <w:r>
+              <w:t>DISSERTATION</w:t>
+            </w:r>
+          </w:p>
+        </w:tc>
+        <w:tc>
+          <w:tcPr>
+            <w:tcW w:type="dxa" w:w="4968"/>
+          </w:tcPr>
+          <w:p>
+            <w:r>
+              <w:t>9</w:t>
+            </w:r>
+          </w:p>
+        </w:tc>
+      </w:tr>
+      <w:tr>
+        <w:tc>
+          <w:tcPr>
+            <w:tcW w:type="dxa" w:w="4968"/>
+          </w:tcPr>
+          <w:p>
+            <w:r>
+              <w:t>REPORT</w:t>
+            </w:r>
+          </w:p>
+        </w:tc>
+        <w:tc>
+          <w:tcPr>
+            <w:tcW w:type="dxa" w:w="4968"/>
+          </w:tcPr>
+          <w:p>
+            <w:r>
+              <w:t>2</w:t>
+            </w:r>
+          </w:p>
+        </w:tc>
+      </w:tr>
+      <w:tr>
+        <w:tc>
+          <w:tcPr>
+            <w:tcW w:type="dxa" w:w="4968"/>
+          </w:tcPr>
+          <w:p>
+            <w:r>
+              <w:t>REVIEW</w:t>
+            </w:r>
+          </w:p>
+        </w:tc>
+        <w:tc>
+          <w:tcPr>
+            <w:tcW w:type="dxa" w:w="4968"/>
+          </w:tcPr>
+          <w:p>
+            <w:r>
+              <w:t>2</w:t>
+            </w:r>
+          </w:p>
+        </w:tc>
+      </w:tr>
+      <w:tr>
+        <w:tc>
+          <w:tcPr>
+            <w:tcW w:type="dxa" w:w="4968"/>
+          </w:tcPr>
+          <w:p>
+            <w:r>
+              <w:t>OTHER</w:t>
+            </w:r>
+          </w:p>
+        </w:tc>
+        <w:tc>
+          <w:tcPr>
+            <w:tcW w:type="dxa" w:w="4968"/>
+          </w:tcPr>
+          <w:p>
+            <w:r>
+              <w:t>2</w:t>
+            </w:r>
+          </w:p>
+        </w:tc>
+      </w:tr>
+      <w:tr>
+        <w:tc>
+          <w:tcPr>
+            <w:tcW w:type="dxa" w:w="4968"/>
+          </w:tcPr>
+          <w:p>
+            <w:r>
+              <w:t>DATASET</w:t>
+            </w:r>
+          </w:p>
+        </w:tc>
+        <w:tc>
+          <w:tcPr>
+            <w:tcW w:type="dxa" w:w="4968"/>
+          </w:tcPr>
+          <w:p>
+            <w:r>
+              <w:t>1</w:t>
+            </w:r>
+          </w:p>
+        </w:tc>
+      </w:tr>
+      <w:tr>
+        <w:tc>
+          <w:tcPr>
+            <w:tcW w:type="dxa" w:w="4968"/>
+          </w:tcPr>
+          <w:p>
+            <w:r>
+              <w:t>SOFTWARE</w:t>
+            </w:r>
+          </w:p>
+        </w:tc>
+        <w:tc>
+          <w:tcPr>
+            <w:tcW w:type="dxa" w:w="4968"/>
+          </w:tcPr>
+          <w:p>
+            <w:r>
+              <w:t>1</w:t>
+            </w:r>
+          </w:p>
+        </w:tc>
+      </w:tr>
+    </w:tbl>
+    <w:p>
+      <w:pPr>
+        <w:pStyle w:val="Heading1"/>
+      </w:pPr>
+      <w:r>
+        <w:t>4. Literature Records</w:t>
+      </w:r>
+    </w:p>
+    <w:tbl>
+      <w:tblPr>
+        <w:tblStyle w:val="TableGrid"/>
+        <w:tblW w:type="auto" w:w="0"/>
+        <w:jc w:val="center"/>
+        <w:tblLook w:firstColumn="1" w:firstRow="1" w:lastColumn="0" w:lastRow="0" w:noHBand="0" w:noVBand="1" w:val="04A0"/>
+      </w:tblPr>
+      <w:tblGrid>
+        <w:gridCol w:w="2484"/>
+        <w:gridCol w:w="2484"/>
+        <w:gridCol w:w="2484"/>
+        <w:gridCol w:w="2484"/>
+      </w:tblGrid>
+      <w:tr>
+        <w:tc>
+          <w:tcPr>
+            <w:tcW w:type="dxa" w:w="2484"/>
+          </w:tcPr>
+          <w:p>
+            <w:r>
+              <w:t>title</w:t>
+            </w:r>
+          </w:p>
+        </w:tc>
+        <w:tc>
+          <w:tcPr>
+            <w:tcW w:type="dxa" w:w="2484"/>
+          </w:tcPr>
+          <w:p>
+            <w:r>
+              <w:t>doi</w:t>
+            </w:r>
+          </w:p>
+        </w:tc>
+        <w:tc>
+          <w:tcPr>
+            <w:tcW w:type="dxa" w:w="2484"/>
+          </w:tcPr>
+          <w:p>
+            <w:r>
+              <w:t>document_category</w:t>
+            </w:r>
+          </w:p>
+        </w:tc>
+        <w:tc>
+          <w:tcPr>
+            <w:tcW w:type="dxa" w:w="2484"/>
+          </w:tcPr>
+          <w:p>
+            <w:r>
+              <w:t>telegram_relevance_score</w:t>
+            </w:r>
+          </w:p>
+        </w:tc>
+      </w:tr>
+      <w:tr>
+        <w:tc>
+          <w:tcPr>
+            <w:tcW w:type="dxa" w:w="2484"/>
+          </w:tcPr>
+          <w:p>
+            <w:r>
+              <w:t>A Large-Scale Study of Telegram Bots</w:t>
+            </w:r>
+          </w:p>
+        </w:tc>
+        <w:tc>
+          <w:tcPr>
+            <w:tcW w:type="dxa" w:w="2484"/>
+          </w:tcPr>
+          <w:p>
+            <w:r/>
+          </w:p>
+        </w:tc>
+        <w:tc>
+          <w:tcPr>
+            <w:tcW w:type="dxa" w:w="2484"/>
+          </w:tcPr>
+          <w:p>
+            <w:r>
+              <w:t>PREPRINT</w:t>
+            </w:r>
+          </w:p>
+        </w:tc>
+        <w:tc>
+          <w:tcPr>
+            <w:tcW w:type="dxa" w:w="2484"/>
+          </w:tcPr>
+          <w:p>
+            <w:r>
+              <w:t>25</w:t>
+            </w:r>
+          </w:p>
+        </w:tc>
+      </w:tr>
+      <w:tr>
+        <w:tc>
+          <w:tcPr>
+            <w:tcW w:type="dxa" w:w="2484"/>
+          </w:tcPr>
+          <w:p>
+            <w:r>
+              <w:t>Development of a Methodology for Assessing the Quality and Communication Capabilities of Government Telegram Bots</w:t>
+            </w:r>
+          </w:p>
+        </w:tc>
+        <w:tc>
+          <w:tcPr>
+            <w:tcW w:type="dxa" w:w="2484"/>
+          </w:tcPr>
+          <w:p>
+            <w:r>
+              <w:t>10.1109/comsds61892.2024.10502066</w:t>
+            </w:r>
+          </w:p>
+        </w:tc>
+        <w:tc>
+          <w:tcPr>
+            <w:tcW w:type="dxa" w:w="2484"/>
+          </w:tcPr>
+          <w:p>
+            <w:r>
+              <w:t>CONFERENCE</w:t>
+            </w:r>
+          </w:p>
+        </w:tc>
+        <w:tc>
+          <w:tcPr>
+            <w:tcW w:type="dxa" w:w="2484"/>
+          </w:tcPr>
+          <w:p>
+            <w:r>
+              <w:t>25</w:t>
+            </w:r>
+          </w:p>
+        </w:tc>
+      </w:tr>
+      <w:tr>
+        <w:tc>
+          <w:tcPr>
+            <w:tcW w:type="dxa" w:w="2484"/>
+          </w:tcPr>
+          <w:p>
+            <w:r>
+              <w:t>AI detection of drug activity in Telegram bots and groups for security applications</w:t>
+            </w:r>
+          </w:p>
+        </w:tc>
+        <w:tc>
+          <w:tcPr>
+            <w:tcW w:type="dxa" w:w="2484"/>
+          </w:tcPr>
+          <w:p>
+            <w:r/>
+          </w:p>
+        </w:tc>
+        <w:tc>
+          <w:tcPr>
+            <w:tcW w:type="dxa" w:w="2484"/>
+          </w:tcPr>
+          <w:p>
+            <w:r>
+              <w:t>REPORT</w:t>
+            </w:r>
+          </w:p>
+        </w:tc>
+        <w:tc>
+          <w:tcPr>
+            <w:tcW w:type="dxa" w:w="2484"/>
+          </w:tcPr>
+          <w:p>
+            <w:r>
+              <w:t>25</w:t>
+            </w:r>
+          </w:p>
+        </w:tc>
+      </w:tr>
+      <w:tr>
+        <w:tc>
+          <w:tcPr>
+            <w:tcW w:type="dxa" w:w="2484"/>
+          </w:tcPr>
+          <w:p>
+            <w:r>
+              <w:t>Using AI in Telegram Bots for Earthquake Information Delivery and Analysis</w:t>
+            </w:r>
+          </w:p>
+        </w:tc>
+        <w:tc>
+          <w:tcPr>
+            <w:tcW w:type="dxa" w:w="2484"/>
+          </w:tcPr>
+          <w:p>
+            <w:r>
+              <w:t>10.46880/tamika.vol5no1.pp110-115</w:t>
+            </w:r>
+          </w:p>
+        </w:tc>
+        <w:tc>
+          <w:tcPr>
+            <w:tcW w:type="dxa" w:w="2484"/>
+          </w:tcPr>
+          <w:p>
+            <w:r>
+              <w:t>JOURNAL</w:t>
+            </w:r>
+          </w:p>
+        </w:tc>
+        <w:tc>
+          <w:tcPr>
+            <w:tcW w:type="dxa" w:w="2484"/>
+          </w:tcPr>
+          <w:p>
+            <w:r>
+              <w:t>25</w:t>
+            </w:r>
+          </w:p>
+        </w:tc>
+      </w:tr>
+      <w:tr>
+        <w:tc>
+          <w:tcPr>
+            <w:tcW w:type="dxa" w:w="2484"/>
+          </w:tcPr>
+          <w:p>
+            <w:r>
+              <w:t>Design and Development of a Ship Fuel Tank Volume Height Monitoring System Using the JSN-SR04T Sensor Based on IoT Telegram Bots with Solar Panel Energy</w:t>
+            </w:r>
+          </w:p>
+        </w:tc>
+        <w:tc>
+          <w:tcPr>
+            <w:tcW w:type="dxa" w:w="2484"/>
+          </w:tcPr>
+          <w:p>
+            <w:r>
+              <w:t>10.2991/978-94-6463-628-4_3</w:t>
+            </w:r>
+          </w:p>
+        </w:tc>
+        <w:tc>
+          <w:tcPr>
+            <w:tcW w:type="dxa" w:w="2484"/>
+          </w:tcPr>
+          <w:p>
+            <w:r>
+              <w:t>BOOK</w:t>
+            </w:r>
+          </w:p>
+        </w:tc>
+        <w:tc>
+          <w:tcPr>
+            <w:tcW w:type="dxa" w:w="2484"/>
+          </w:tcPr>
+          <w:p>
+            <w:r>
+              <w:t>25</w:t>
+            </w:r>
+          </w:p>
+        </w:tc>
+      </w:tr>
+      <w:tr>
+        <w:tc>
+          <w:tcPr>
+            <w:tcW w:type="dxa" w:w="2484"/>
+          </w:tcPr>
+          <w:p>
+            <w:r>
+              <w:t>Implementasi Telegram Bot berbasis OCR (Optical Character Recognition) dan NLP (Natural Language Processing) untuk Pencatatan Penjualan pada UMKM</w:t>
+            </w:r>
+          </w:p>
+        </w:tc>
+        <w:tc>
+          <w:tcPr>
+            <w:tcW w:type="dxa" w:w="2484"/>
+          </w:tcPr>
+          <w:p>
+            <w:r>
+              <w:t>10.69930/jtsm.v3i4.864</w:t>
+            </w:r>
+          </w:p>
+        </w:tc>
+        <w:tc>
+          <w:tcPr>
+            <w:tcW w:type="dxa" w:w="2484"/>
+          </w:tcPr>
+          <w:p>
+            <w:r>
+              <w:t>JOURNAL</w:t>
+            </w:r>
+          </w:p>
+        </w:tc>
+        <w:tc>
+          <w:tcPr>
+            <w:tcW w:type="dxa" w:w="2484"/>
+          </w:tcPr>
+          <w:p>
+            <w:r>
+              <w:t>23</w:t>
+            </w:r>
+          </w:p>
+        </w:tc>
+      </w:tr>
+      <w:tr>
+        <w:tc>
+          <w:tcPr>
+            <w:tcW w:type="dxa" w:w="2484"/>
+          </w:tcPr>
+          <w:p>
+            <w:r>
+              <w:t>RANCANG BANGUN SISTEM CHATBOT PEMESANANMENU MAKANAN DAN MINUMAN PADA RESTORAN BERBASIS TELEGRAM BOT DENGAN PENDEKATAN NATURAL LANGUAGE PROCESSING</w:t>
+            </w:r>
+          </w:p>
+        </w:tc>
+        <w:tc>
+          <w:tcPr>
+            <w:tcW w:type="dxa" w:w="2484"/>
+          </w:tcPr>
+          <w:p>
+            <w:r>
+              <w:t>10.24843/spektrum.2024.v11.i02.p24</w:t>
+            </w:r>
+          </w:p>
+        </w:tc>
+        <w:tc>
+          <w:tcPr>
+            <w:tcW w:type="dxa" w:w="2484"/>
+          </w:tcPr>
+          <w:p>
+            <w:r>
+              <w:t>JOURNAL</w:t>
+            </w:r>
+          </w:p>
+        </w:tc>
+        <w:tc>
+          <w:tcPr>
+            <w:tcW w:type="dxa" w:w="2484"/>
+          </w:tcPr>
+          <w:p>
+            <w:r>
+              <w:t>23</w:t>
+            </w:r>
+          </w:p>
+        </w:tc>
+      </w:tr>
+      <w:tr>
+        <w:tc>
+          <w:tcPr>
+            <w:tcW w:type="dxa" w:w="2484"/>
+          </w:tcPr>
+          <w:p>
+            <w:r>
+              <w:t>Telegram Bot for Calorie Intake Tracking Using Natural Language Processing</w:t>
+            </w:r>
+          </w:p>
+        </w:tc>
+        <w:tc>
+          <w:tcPr>
+            <w:tcW w:type="dxa" w:w="2484"/>
+          </w:tcPr>
+          <w:p>
+            <w:r/>
+          </w:p>
+        </w:tc>
+        <w:tc>
+          <w:tcPr>
+            <w:tcW w:type="dxa" w:w="2484"/>
+          </w:tcPr>
+          <w:p>
+            <w:r>
+              <w:t>DISSERTATION</w:t>
+            </w:r>
+          </w:p>
+        </w:tc>
+        <w:tc>
+          <w:tcPr>
+            <w:tcW w:type="dxa" w:w="2484"/>
+          </w:tcPr>
+          <w:p>
+            <w:r>
+              <w:t>19</w:t>
+            </w:r>
+          </w:p>
+        </w:tc>
+      </w:tr>
+      <w:tr>
+        <w:tc>
+          <w:tcPr>
+            <w:tcW w:type="dxa" w:w="2484"/>
+          </w:tcPr>
+          <w:p>
+            <w:r>
+              <w:t>Development of a Telegram bot for processing music content using artificial intelligence</w:t>
+            </w:r>
+          </w:p>
+        </w:tc>
+        <w:tc>
+          <w:tcPr>
+            <w:tcW w:type="dxa" w:w="2484"/>
+          </w:tcPr>
+          <w:p>
+            <w:r/>
+          </w:p>
+        </w:tc>
+        <w:tc>
+          <w:tcPr>
+            <w:tcW w:type="dxa" w:w="2484"/>
+          </w:tcPr>
+          <w:p>
+            <w:r>
+              <w:t>DISSERTATION</w:t>
+            </w:r>
+          </w:p>
+        </w:tc>
+        <w:tc>
+          <w:tcPr>
+            <w:tcW w:type="dxa" w:w="2484"/>
+          </w:tcPr>
+          <w:p>
+            <w:r>
+              <w:t>19</w:t>
+            </w:r>
+          </w:p>
+        </w:tc>
+      </w:tr>
+      <w:tr>
+        <w:tc>
+          <w:tcPr>
+            <w:tcW w:type="dxa" w:w="2484"/>
+          </w:tcPr>
+          <w:p>
+            <w:r>
+              <w:t>Development of a multifunctional artificial intelligence based Telegram bot for supporting school education</w:t>
+            </w:r>
+          </w:p>
+        </w:tc>
+        <w:tc>
+          <w:tcPr>
+            <w:tcW w:type="dxa" w:w="2484"/>
+          </w:tcPr>
+          <w:p>
+            <w:r>
+              <w:t>10.65247/3105-3432-2026-2.01</w:t>
+            </w:r>
+          </w:p>
+        </w:tc>
+        <w:tc>
+          <w:tcPr>
+            <w:tcW w:type="dxa" w:w="2484"/>
+          </w:tcPr>
+          <w:p>
+            <w:r>
+              <w:t>JOURNAL</w:t>
+            </w:r>
+          </w:p>
+        </w:tc>
+        <w:tc>
+          <w:tcPr>
+            <w:tcW w:type="dxa" w:w="2484"/>
+          </w:tcPr>
+          <w:p>
+            <w:r>
+              <w:t>19</w:t>
+            </w:r>
+          </w:p>
+        </w:tc>
+      </w:tr>
+      <w:tr>
+        <w:tc>
+          <w:tcPr>
+            <w:tcW w:type="dxa" w:w="2484"/>
+          </w:tcPr>
+          <w:p>
+            <w:r>
+              <w:t>Revolutionizing Skin Cancer Diagnosis with AI: Integrating YOLO-Based Lesion Detection into a Telegram Chatbot</w:t>
+            </w:r>
+          </w:p>
+        </w:tc>
+        <w:tc>
+          <w:tcPr>
+            <w:tcW w:type="dxa" w:w="2484"/>
+          </w:tcPr>
+          <w:p>
+            <w:r>
+              <w:t>10.51584/ijrias.2026.11060094</w:t>
+            </w:r>
+          </w:p>
+        </w:tc>
+        <w:tc>
+          <w:tcPr>
+            <w:tcW w:type="dxa" w:w="2484"/>
+          </w:tcPr>
+          <w:p>
+            <w:r>
+              <w:t>JOURNAL</w:t>
+            </w:r>
+          </w:p>
+        </w:tc>
+        <w:tc>
+          <w:tcPr>
+            <w:tcW w:type="dxa" w:w="2484"/>
+          </w:tcPr>
+          <w:p>
+            <w:r>
+              <w:t>19</w:t>
+            </w:r>
+          </w:p>
+        </w:tc>
+      </w:tr>
+      <w:tr>
+        <w:tc>
+          <w:tcPr>
+            <w:tcW w:type="dxa" w:w="2484"/>
+          </w:tcPr>
+          <w:p>
+            <w:r>
+              <w:t>LPG Gas Leak Detection System and LPG Fire Classification Based on Internet of Things and Artificial Intelligence with Telegram Bot as a Monitoring Tool</w:t>
+            </w:r>
+          </w:p>
+        </w:tc>
+        <w:tc>
+          <w:tcPr>
+            <w:tcW w:type="dxa" w:w="2484"/>
+          </w:tcPr>
+          <w:p>
+            <w:r>
+              <w:t>10.30998/faktorexacta.v17i3.21920</w:t>
+            </w:r>
+          </w:p>
+        </w:tc>
+        <w:tc>
+          <w:tcPr>
+            <w:tcW w:type="dxa" w:w="2484"/>
+          </w:tcPr>
+          <w:p>
+            <w:r>
+              <w:t>JOURNAL</w:t>
+            </w:r>
+          </w:p>
+        </w:tc>
+        <w:tc>
+          <w:tcPr>
+            <w:tcW w:type="dxa" w:w="2484"/>
+          </w:tcPr>
+          <w:p>
+            <w:r>
+              <w:t>19</w:t>
+            </w:r>
+          </w:p>
+        </w:tc>
+      </w:tr>
+      <w:tr>
+        <w:tc>
+          <w:tcPr>
+            <w:tcW w:type="dxa" w:w="2484"/>
+          </w:tcPr>
+          <w:p>
+            <w:r>
+              <w:t>Telegram bot for providing reference materials on first aid based on artificial intelligence models</w:t>
+            </w:r>
+          </w:p>
+        </w:tc>
+        <w:tc>
+          <w:tcPr>
+            <w:tcW w:type="dxa" w:w="2484"/>
+          </w:tcPr>
+          <w:p>
+            <w:r/>
+          </w:p>
+        </w:tc>
+        <w:tc>
+          <w:tcPr>
+            <w:tcW w:type="dxa" w:w="2484"/>
+          </w:tcPr>
+          <w:p>
+            <w:r>
+              <w:t>DISSERTATION</w:t>
+            </w:r>
+          </w:p>
+        </w:tc>
+        <w:tc>
+          <w:tcPr>
+            <w:tcW w:type="dxa" w:w="2484"/>
+          </w:tcPr>
+          <w:p>
+            <w:r>
+              <w:t>19</w:t>
+            </w:r>
+          </w:p>
+        </w:tc>
+      </w:tr>
+      <w:tr>
+        <w:tc>
+          <w:tcPr>
+            <w:tcW w:type="dxa" w:w="2484"/>
+          </w:tcPr>
+          <w:p>
+            <w:r>
+              <w:t>Question Answering System pada Chatbot Telegram Menggunakan Large Language Models (LLM) dan Langchain (Studi Kasus UU Kesehatan)</w:t>
+            </w:r>
+          </w:p>
+        </w:tc>
+        <w:tc>
+          <w:tcPr>
+            <w:tcW w:type="dxa" w:w="2484"/>
+          </w:tcPr>
+          <w:p>
+            <w:r>
+              <w:t>10.57152/malcom.v4i3.1378</w:t>
+            </w:r>
+          </w:p>
+        </w:tc>
+        <w:tc>
+          <w:tcPr>
+            <w:tcW w:type="dxa" w:w="2484"/>
+          </w:tcPr>
+          <w:p>
+            <w:r>
+              <w:t>JOURNAL</w:t>
+            </w:r>
+          </w:p>
+        </w:tc>
+        <w:tc>
+          <w:tcPr>
+            <w:tcW w:type="dxa" w:w="2484"/>
+          </w:tcPr>
+          <w:p>
+            <w:r>
+              <w:t>17</w:t>
+            </w:r>
+          </w:p>
+        </w:tc>
+      </w:tr>
+      <w:tr>
+        <w:tc>
+          <w:tcPr>
+            <w:tcW w:type="dxa" w:w="2484"/>
+          </w:tcPr>
+          <w:p>
+            <w:r>
+              <w:t>Schema Prevalence and Variation: A Study of 7500 Young Schema Questionnaires from Iranian Telegram Bot Users</w:t>
+            </w:r>
+          </w:p>
+        </w:tc>
+        <w:tc>
+          <w:tcPr>
+            <w:tcW w:type="dxa" w:w="2484"/>
+          </w:tcPr>
+          <w:p>
+            <w:r>
+              <w:t>10.61838/kman.cp.psynexus.3.3</w:t>
+            </w:r>
+          </w:p>
+        </w:tc>
+        <w:tc>
+          <w:tcPr>
+            <w:tcW w:type="dxa" w:w="2484"/>
+          </w:tcPr>
+          <w:p>
+            <w:r>
+              <w:t>JOURNAL</w:t>
+            </w:r>
+          </w:p>
+        </w:tc>
+        <w:tc>
+          <w:tcPr>
+            <w:tcW w:type="dxa" w:w="2484"/>
+          </w:tcPr>
+          <w:p>
+            <w:r>
+              <w:t>15</w:t>
+            </w:r>
+          </w:p>
+        </w:tc>
+      </w:tr>
+      <w:tr>
+        <w:tc>
+          <w:tcPr>
+            <w:tcW w:type="dxa" w:w="2484"/>
+          </w:tcPr>
+          <w:p>
+            <w:r>
+              <w:t>IoT-Based Automated Environmental Control System for Oyster Mushroom Cultivation Using ESP8266 and Telegram Bot</w:t>
+            </w:r>
+          </w:p>
+        </w:tc>
+        <w:tc>
+          <w:tcPr>
+            <w:tcW w:type="dxa" w:w="2484"/>
+          </w:tcPr>
+          <w:p>
+            <w:r>
+              <w:t>10.1109/icic64337.2024.10956269</w:t>
+            </w:r>
+          </w:p>
+        </w:tc>
+        <w:tc>
+          <w:tcPr>
+            <w:tcW w:type="dxa" w:w="2484"/>
+          </w:tcPr>
+          <w:p>
+            <w:r>
+              <w:t>CONFERENCE</w:t>
+            </w:r>
+          </w:p>
+        </w:tc>
+        <w:tc>
+          <w:tcPr>
+            <w:tcW w:type="dxa" w:w="2484"/>
+          </w:tcPr>
+          <w:p>
+            <w:r>
+              <w:t>15</w:t>
+            </w:r>
+          </w:p>
+        </w:tc>
+      </w:tr>
+      <w:tr>
+        <w:tc>
+          <w:tcPr>
+            <w:tcW w:type="dxa" w:w="2484"/>
+          </w:tcPr>
+          <w:p>
+            <w:r>
+              <w:t>Emergency System for the Elderly Based on Sound Sensor with Telegram Bot Notification and Voice Alarm</w:t>
+            </w:r>
+          </w:p>
+        </w:tc>
+        <w:tc>
+          <w:tcPr>
+            <w:tcW w:type="dxa" w:w="2484"/>
+          </w:tcPr>
+          <w:p>
+            <w:r>
+              <w:t>10.33795/jartel.v14i2.5274</w:t>
+            </w:r>
+          </w:p>
+        </w:tc>
+        <w:tc>
+          <w:tcPr>
+            <w:tcW w:type="dxa" w:w="2484"/>
+          </w:tcPr>
+          <w:p>
+            <w:r>
+              <w:t>JOURNAL</w:t>
+            </w:r>
+          </w:p>
+        </w:tc>
+        <w:tc>
+          <w:tcPr>
+            <w:tcW w:type="dxa" w:w="2484"/>
+          </w:tcPr>
+          <w:p>
+            <w:r>
+              <w:t>15</w:t>
+            </w:r>
+          </w:p>
+        </w:tc>
+      </w:tr>
+      <w:tr>
+        <w:tc>
+          <w:tcPr>
+            <w:tcW w:type="dxa" w:w="2484"/>
+          </w:tcPr>
+          <w:p>
+            <w:r>
+              <w:t>Telegram bot-based Flood Early Warning System with WSN Integration</w:t>
+            </w:r>
+          </w:p>
+        </w:tc>
+        <w:tc>
+          <w:tcPr>
+            <w:tcW w:type="dxa" w:w="2484"/>
+          </w:tcPr>
+          <w:p>
+            <w:r>
+              <w:t>10.33096/ilkom.v16i2.1699.151-160</w:t>
+            </w:r>
+          </w:p>
+        </w:tc>
+        <w:tc>
+          <w:tcPr>
+            <w:tcW w:type="dxa" w:w="2484"/>
+          </w:tcPr>
+          <w:p>
+            <w:r>
+              <w:t>JOURNAL</w:t>
+            </w:r>
+          </w:p>
+        </w:tc>
+        <w:tc>
+          <w:tcPr>
+            <w:tcW w:type="dxa" w:w="2484"/>
+          </w:tcPr>
+          <w:p>
+            <w:r>
+              <w:t>15</w:t>
+            </w:r>
+          </w:p>
+        </w:tc>
+      </w:tr>
+      <w:tr>
+        <w:tc>
+          <w:tcPr>
+            <w:tcW w:type="dxa" w:w="2484"/>
+          </w:tcPr>
+          <w:p>
+            <w:r>
+              <w:t>Development of an Informational Telegram Bot for a Logistics Company</w:t>
+            </w:r>
+          </w:p>
+        </w:tc>
+        <w:tc>
+          <w:tcPr>
+            <w:tcW w:type="dxa" w:w="2484"/>
+          </w:tcPr>
+          <w:p>
+            <w:r>
+              <w:t>10.33774/coe-2025-sgph8</w:t>
+            </w:r>
+          </w:p>
+        </w:tc>
+        <w:tc>
+          <w:tcPr>
+            <w:tcW w:type="dxa" w:w="2484"/>
+          </w:tcPr>
+          <w:p>
+            <w:r>
+              <w:t>PREPRINT</w:t>
+            </w:r>
+          </w:p>
+        </w:tc>
+        <w:tc>
+          <w:tcPr>
+            <w:tcW w:type="dxa" w:w="2484"/>
+          </w:tcPr>
+          <w:p>
+            <w:r>
+              <w:t>15</w:t>
+            </w:r>
+          </w:p>
+        </w:tc>
+      </w:tr>
+      <w:tr>
+        <w:tc>
+          <w:tcPr>
+            <w:tcW w:type="dxa" w:w="2484"/>
+          </w:tcPr>
+          <w:p>
+            <w:r>
+              <w:t>Innovative approaches to the diagnosis of premenstrual syndrome: the role of the Telegram bot in clinical practice</w:t>
+            </w:r>
+          </w:p>
+        </w:tc>
+        <w:tc>
+          <w:tcPr>
+            <w:tcW w:type="dxa" w:w="2484"/>
+          </w:tcPr>
+          <w:p>
+            <w:r>
+              <w:t>10.19163/1994-9480-2025-22-4-182-185</w:t>
+            </w:r>
+          </w:p>
+        </w:tc>
+        <w:tc>
+          <w:tcPr>
+            <w:tcW w:type="dxa" w:w="2484"/>
+          </w:tcPr>
+          <w:p>
+            <w:r>
+              <w:t>JOURNAL</w:t>
+            </w:r>
+          </w:p>
+        </w:tc>
+        <w:tc>
+          <w:tcPr>
+            <w:tcW w:type="dxa" w:w="2484"/>
+          </w:tcPr>
+          <w:p>
+            <w:r>
+              <w:t>15</w:t>
+            </w:r>
+          </w:p>
+        </w:tc>
+      </w:tr>
+      <w:tr>
+        <w:tc>
+          <w:tcPr>
+            <w:tcW w:type="dxa" w:w="2484"/>
+          </w:tcPr>
+          <w:p>
+            <w:r>
+              <w:t>A SYSTEM FOR COLLECTING STATISTICAL DATA ABOUT DEFECTS IN METAL STRUCTURES BASED ON TELEGRAM BOT</w:t>
+            </w:r>
+          </w:p>
+        </w:tc>
+        <w:tc>
+          <w:tcPr>
+            <w:tcW w:type="dxa" w:w="2484"/>
+          </w:tcPr>
+          <w:p>
+            <w:r>
+              <w:t>10.20998/2413-4295.2025.01.05</w:t>
+            </w:r>
+          </w:p>
+        </w:tc>
+        <w:tc>
+          <w:tcPr>
+            <w:tcW w:type="dxa" w:w="2484"/>
+          </w:tcPr>
+          <w:p>
+            <w:r>
+              <w:t>JOURNAL</w:t>
+            </w:r>
+          </w:p>
+        </w:tc>
+        <w:tc>
+          <w:tcPr>
+            <w:tcW w:type="dxa" w:w="2484"/>
+          </w:tcPr>
+          <w:p>
+            <w:r>
+              <w:t>15</w:t>
+            </w:r>
+          </w:p>
+        </w:tc>
+      </w:tr>
+      <w:tr>
+        <w:tc>
+          <w:tcPr>
+            <w:tcW w:type="dxa" w:w="2484"/>
+          </w:tcPr>
+          <w:p>
+            <w:r>
+              <w:t>Personalized Self-Assessment Tool Using a Telegram Bot: A Case Study on Data Structures and Algorithms</w:t>
+            </w:r>
+          </w:p>
+        </w:tc>
+        <w:tc>
+          <w:tcPr>
+            <w:tcW w:type="dxa" w:w="2484"/>
+          </w:tcPr>
+          <w:p>
+            <w:r>
+              <w:t>10.1109/educon60312.2024.10578697</w:t>
+            </w:r>
+          </w:p>
+        </w:tc>
+        <w:tc>
+          <w:tcPr>
+            <w:tcW w:type="dxa" w:w="2484"/>
+          </w:tcPr>
+          <w:p>
+            <w:r>
+              <w:t>CONFERENCE</w:t>
+            </w:r>
+          </w:p>
+        </w:tc>
+        <w:tc>
+          <w:tcPr>
+            <w:tcW w:type="dxa" w:w="2484"/>
+          </w:tcPr>
+          <w:p>
+            <w:r>
+              <w:t>15</w:t>
+            </w:r>
+          </w:p>
+        </w:tc>
+      </w:tr>
+      <w:tr>
+        <w:tc>
+          <w:tcPr>
+            <w:tcW w:type="dxa" w:w="2484"/>
+          </w:tcPr>
+          <w:p>
+            <w:r>
+              <w:t>Smart Accidental Alert and Location Tracking System Using Telegram Bot and GPS Technology</w:t>
+            </w:r>
+          </w:p>
+        </w:tc>
+        <w:tc>
+          <w:tcPr>
+            <w:tcW w:type="dxa" w:w="2484"/>
+          </w:tcPr>
+          <w:p>
+            <w:r>
+              <w:t>10.1007/978-981-97-3651-5_27</w:t>
+            </w:r>
+          </w:p>
+        </w:tc>
+        <w:tc>
+          <w:tcPr>
+            <w:tcW w:type="dxa" w:w="2484"/>
+          </w:tcPr>
+          <w:p>
+            <w:r>
+              <w:t>CONFERENCE</w:t>
+            </w:r>
+          </w:p>
+        </w:tc>
+        <w:tc>
+          <w:tcPr>
+            <w:tcW w:type="dxa" w:w="2484"/>
+          </w:tcPr>
+          <w:p>
+            <w:r>
+              <w:t>15</w:t>
+            </w:r>
+          </w:p>
+        </w:tc>
+      </w:tr>
+      <w:tr>
+        <w:tc>
+          <w:tcPr>
+            <w:tcW w:type="dxa" w:w="2484"/>
+          </w:tcPr>
+          <w:p>
+            <w:r>
+              <w:t>Development of a Telegram Bot for Automation of Reporting of Contractors in Construction</w:t>
+            </w:r>
+          </w:p>
+        </w:tc>
+        <w:tc>
+          <w:tcPr>
+            <w:tcW w:type="dxa" w:w="2484"/>
+          </w:tcPr>
+          <w:p>
+            <w:r>
+              <w:t>10.22213/2410-9304-2025-3-88-95</w:t>
+            </w:r>
+          </w:p>
+        </w:tc>
+        <w:tc>
+          <w:tcPr>
+            <w:tcW w:type="dxa" w:w="2484"/>
+          </w:tcPr>
+          <w:p>
+            <w:r>
+              <w:t>JOURNAL</w:t>
+            </w:r>
+          </w:p>
+        </w:tc>
+        <w:tc>
+          <w:tcPr>
+            <w:tcW w:type="dxa" w:w="2484"/>
+          </w:tcPr>
+          <w:p>
+            <w:r>
+              <w:t>15</w:t>
+            </w:r>
+          </w:p>
+        </w:tc>
+      </w:tr>
+      <w:tr>
+        <w:tc>
+          <w:tcPr>
+            <w:tcW w:type="dxa" w:w="2484"/>
+          </w:tcPr>
+          <w:p>
+            <w:r>
+              <w:t>Intelligent Cold Chain Security: Nano Power Temperature Sensors, ESP32 and Telegram Bot Integration for Temperature Assurance and Environmental Harm Prevention</w:t>
+            </w:r>
+          </w:p>
+        </w:tc>
+        <w:tc>
+          <w:tcPr>
+            <w:tcW w:type="dxa" w:w="2484"/>
+          </w:tcPr>
+          <w:p>
+            <w:r>
+              <w:t>10.13074/jent.2024.03.241492</w:t>
+            </w:r>
+          </w:p>
+        </w:tc>
+        <w:tc>
+          <w:tcPr>
+            <w:tcW w:type="dxa" w:w="2484"/>
+          </w:tcPr>
+          <w:p>
+            <w:r>
+              <w:t>JOURNAL</w:t>
+            </w:r>
+          </w:p>
+        </w:tc>
+        <w:tc>
+          <w:tcPr>
+            <w:tcW w:type="dxa" w:w="2484"/>
+          </w:tcPr>
+          <w:p>
+            <w:r>
+              <w:t>15</w:t>
+            </w:r>
+          </w:p>
+        </w:tc>
+      </w:tr>
+      <w:tr>
+        <w:tc>
+          <w:tcPr>
+            <w:tcW w:type="dxa" w:w="2484"/>
+          </w:tcPr>
+          <w:p>
+            <w:r>
+              <w:t>AN IOT-BASED AUTOMATED WATERING SYSTEM FOR PLANTS USING INTEGRATED FUZZY LOGIC AND TELEGRAM BOT</w:t>
+            </w:r>
+          </w:p>
+        </w:tc>
+        <w:tc>
+          <w:tcPr>
+            <w:tcW w:type="dxa" w:w="2484"/>
+          </w:tcPr>
+          <w:p>
+            <w:r>
+              <w:t>10.12962/j24068535.v22i2.a1191</w:t>
+            </w:r>
+          </w:p>
+        </w:tc>
+        <w:tc>
+          <w:tcPr>
+            <w:tcW w:type="dxa" w:w="2484"/>
+          </w:tcPr>
+          <w:p>
+            <w:r>
+              <w:t>JOURNAL</w:t>
+            </w:r>
+          </w:p>
+        </w:tc>
+        <w:tc>
+          <w:tcPr>
+            <w:tcW w:type="dxa" w:w="2484"/>
+          </w:tcPr>
+          <w:p>
+            <w:r>
+              <w:t>15</w:t>
+            </w:r>
+          </w:p>
+        </w:tc>
+      </w:tr>
+      <w:tr>
+        <w:tc>
+          <w:tcPr>
+            <w:tcW w:type="dxa" w:w="2484"/>
+          </w:tcPr>
+          <w:p>
+            <w:r>
+              <w:t>Telegram BOT Application Development Integration with Google Sheets for Sending Service Reporting</w:t>
+            </w:r>
+          </w:p>
+        </w:tc>
+        <w:tc>
+          <w:tcPr>
+            <w:tcW w:type="dxa" w:w="2484"/>
+          </w:tcPr>
+          <w:p>
+            <w:r>
+              <w:t>10.59934/jaiea.v4i3.1136</w:t>
+            </w:r>
+          </w:p>
+        </w:tc>
+        <w:tc>
+          <w:tcPr>
+            <w:tcW w:type="dxa" w:w="2484"/>
+          </w:tcPr>
+          <w:p>
+            <w:r>
+              <w:t>JOURNAL</w:t>
+            </w:r>
+          </w:p>
+        </w:tc>
+        <w:tc>
+          <w:tcPr>
+            <w:tcW w:type="dxa" w:w="2484"/>
+          </w:tcPr>
+          <w:p>
+            <w:r>
+              <w:t>15</w:t>
+            </w:r>
+          </w:p>
+        </w:tc>
+      </w:tr>
+      <w:tr>
+        <w:tc>
+          <w:tcPr>
+            <w:tcW w:type="dxa" w:w="2484"/>
+          </w:tcPr>
+          <w:p>
+            <w:r>
+              <w:t>Utilization of Telegram Bot for Integrated Data Visualization with Google Sheets at PT Telkom Cibitung</w:t>
+            </w:r>
+          </w:p>
+        </w:tc>
+        <w:tc>
+          <w:tcPr>
+            <w:tcW w:type="dxa" w:w="2484"/>
+          </w:tcPr>
+          <w:p>
+            <w:r>
+              <w:t>10.59934/jaiea.v4i3.1148</w:t>
+            </w:r>
+          </w:p>
+        </w:tc>
+        <w:tc>
+          <w:tcPr>
+            <w:tcW w:type="dxa" w:w="2484"/>
+          </w:tcPr>
+          <w:p>
+            <w:r>
+              <w:t>JOURNAL</w:t>
+            </w:r>
+          </w:p>
+        </w:tc>
+        <w:tc>
+          <w:tcPr>
+            <w:tcW w:type="dxa" w:w="2484"/>
+          </w:tcPr>
+          <w:p>
+            <w:r>
+              <w:t>15</w:t>
+            </w:r>
+          </w:p>
+        </w:tc>
+      </w:tr>
+      <w:tr>
+        <w:tc>
+          <w:tcPr>
+            <w:tcW w:type="dxa" w:w="2484"/>
+          </w:tcPr>
+          <w:p>
+            <w:r>
+              <w:t>Enhancing university education with AI: a Telegram bot leveraging RAG and external APIs for secure knowledge retrieval</w:t>
+            </w:r>
+          </w:p>
+        </w:tc>
+        <w:tc>
+          <w:tcPr>
+            <w:tcW w:type="dxa" w:w="2484"/>
+          </w:tcPr>
+          <w:p>
+            <w:r>
+              <w:t>10.48009/3_iis_2025_2025_133</w:t>
+            </w:r>
+          </w:p>
+        </w:tc>
+        <w:tc>
+          <w:tcPr>
+            <w:tcW w:type="dxa" w:w="2484"/>
+          </w:tcPr>
+          <w:p>
+            <w:r>
+              <w:t>JOURNAL</w:t>
+            </w:r>
+          </w:p>
+        </w:tc>
+        <w:tc>
+          <w:tcPr>
+            <w:tcW w:type="dxa" w:w="2484"/>
+          </w:tcPr>
+          <w:p>
+            <w:r>
+              <w:t>15</w:t>
+            </w:r>
+          </w:p>
+        </w:tc>
+      </w:tr>
+      <w:tr>
+        <w:tc>
+          <w:tcPr>
+            <w:tcW w:type="dxa" w:w="2484"/>
+          </w:tcPr>
+          <w:p>
+            <w:r>
+              <w:t>Enhancing Communication Security with a Telegram Bot for Encrypted Image Communication Using F5-LSB Steganography</w:t>
+            </w:r>
+          </w:p>
+        </w:tc>
+        <w:tc>
+          <w:tcPr>
+            <w:tcW w:type="dxa" w:w="2484"/>
+          </w:tcPr>
+          <w:p>
+            <w:r>
+              <w:t>10.1109/icoeca62351.2024.00037</w:t>
+            </w:r>
+          </w:p>
+        </w:tc>
+        <w:tc>
+          <w:tcPr>
+            <w:tcW w:type="dxa" w:w="2484"/>
+          </w:tcPr>
+          <w:p>
+            <w:r>
+              <w:t>CONFERENCE</w:t>
+            </w:r>
+          </w:p>
+        </w:tc>
+        <w:tc>
+          <w:tcPr>
+            <w:tcW w:type="dxa" w:w="2484"/>
+          </w:tcPr>
+          <w:p>
+            <w:r>
+              <w:t>15</w:t>
+            </w:r>
+          </w:p>
+        </w:tc>
+      </w:tr>
+      <w:tr>
+        <w:tc>
+          <w:tcPr>
+            <w:tcW w:type="dxa" w:w="2484"/>
+          </w:tcPr>
+          <w:p>
+            <w:r>
+              <w:t>Developing an Open-access Telegram Bot for Automated, estimation and IA-based interpreted of OpenQuake Ground-Motion intensity measures</w:t>
+            </w:r>
+          </w:p>
+        </w:tc>
+        <w:tc>
+          <w:tcPr>
+            <w:tcW w:type="dxa" w:w="2484"/>
+          </w:tcPr>
+          <w:p>
+            <w:r>
+              <w:t>10.31223/x5p468</w:t>
+            </w:r>
+          </w:p>
+        </w:tc>
+        <w:tc>
+          <w:tcPr>
+            <w:tcW w:type="dxa" w:w="2484"/>
+          </w:tcPr>
+          <w:p>
+            <w:r>
+              <w:t>PREPRINT</w:t>
+            </w:r>
+          </w:p>
+        </w:tc>
+        <w:tc>
+          <w:tcPr>
+            <w:tcW w:type="dxa" w:w="2484"/>
+          </w:tcPr>
+          <w:p>
+            <w:r>
+              <w:t>15</w:t>
+            </w:r>
+          </w:p>
+        </w:tc>
+      </w:tr>
+      <w:tr>
+        <w:tc>
+          <w:tcPr>
+            <w:tcW w:type="dxa" w:w="2484"/>
+          </w:tcPr>
+          <w:p>
+            <w:r>
+              <w:t>Security System in A Private Room Using Esp32 Microcontroller with Telegram Bot</w:t>
+            </w:r>
+          </w:p>
+        </w:tc>
+        <w:tc>
+          <w:tcPr>
+            <w:tcW w:type="dxa" w:w="2484"/>
+          </w:tcPr>
+          <w:p>
+            <w:r>
+              <w:t>10.37058/jeee.v6i2.14951</w:t>
+            </w:r>
+          </w:p>
+        </w:tc>
+        <w:tc>
+          <w:tcPr>
+            <w:tcW w:type="dxa" w:w="2484"/>
+          </w:tcPr>
+          <w:p>
+            <w:r>
+              <w:t>JOURNAL</w:t>
+            </w:r>
+          </w:p>
+        </w:tc>
+        <w:tc>
+          <w:tcPr>
+            <w:tcW w:type="dxa" w:w="2484"/>
+          </w:tcPr>
+          <w:p>
+            <w:r>
+              <w:t>15</w:t>
+            </w:r>
+          </w:p>
+        </w:tc>
+      </w:tr>
+      <w:tr>
+        <w:tc>
+          <w:tcPr>
+            <w:tcW w:type="dxa" w:w="2484"/>
+          </w:tcPr>
+          <w:p>
+            <w:r>
+              <w:t>ML-Based College Predictor Telegram Bot Indian Engineering Colleges</w:t>
+            </w:r>
+          </w:p>
+        </w:tc>
+        <w:tc>
+          <w:tcPr>
+            <w:tcW w:type="dxa" w:w="2484"/>
+          </w:tcPr>
+          <w:p>
+            <w:r>
+              <w:t>10.1109/icaet63349.2025.10932281</w:t>
+            </w:r>
+          </w:p>
+        </w:tc>
+        <w:tc>
+          <w:tcPr>
+            <w:tcW w:type="dxa" w:w="2484"/>
+          </w:tcPr>
+          <w:p>
+            <w:r>
+              <w:t>CONFERENCE</w:t>
+            </w:r>
+          </w:p>
+        </w:tc>
+        <w:tc>
+          <w:tcPr>
+            <w:tcW w:type="dxa" w:w="2484"/>
+          </w:tcPr>
+          <w:p>
+            <w:r>
+              <w:t>15</w:t>
+            </w:r>
+          </w:p>
+        </w:tc>
+      </w:tr>
+      <w:tr>
+        <w:tc>
+          <w:tcPr>
+            <w:tcW w:type="dxa" w:w="2484"/>
+          </w:tcPr>
+          <w:p>
+            <w:r>
+              <w:t>IMPLEMENTATION OF ESP32-CAM AND TELEGRAM BOT FOR AUTOMATIC CUSTOMER ARRIVAL DETECTION SYSTEM</w:t>
+            </w:r>
+          </w:p>
+        </w:tc>
+        <w:tc>
+          <w:tcPr>
+            <w:tcW w:type="dxa" w:w="2484"/>
+          </w:tcPr>
+          <w:p>
+            <w:r>
+              <w:t>10.24912/tesla.v26i2.32950</w:t>
+            </w:r>
+          </w:p>
+        </w:tc>
+        <w:tc>
+          <w:tcPr>
+            <w:tcW w:type="dxa" w:w="2484"/>
+          </w:tcPr>
+          <w:p>
+            <w:r>
+              <w:t>JOURNAL</w:t>
+            </w:r>
+          </w:p>
+        </w:tc>
+        <w:tc>
+          <w:tcPr>
+            <w:tcW w:type="dxa" w:w="2484"/>
+          </w:tcPr>
+          <w:p>
+            <w:r>
+              <w:t>15</w:t>
+            </w:r>
+          </w:p>
+        </w:tc>
+      </w:tr>
+      <w:tr>
+        <w:tc>
+          <w:tcPr>
+            <w:tcW w:type="dxa" w:w="2484"/>
+          </w:tcPr>
+          <w:p>
+            <w:r>
+              <w:t>Design and Optimization of an IR-Based Automation System with Telegram Bot Integration for Remote Device Control</w:t>
+            </w:r>
+          </w:p>
+        </w:tc>
+        <w:tc>
+          <w:tcPr>
+            <w:tcW w:type="dxa" w:w="2484"/>
+          </w:tcPr>
+          <w:p>
+            <w:r>
+              <w:t>10.1109/icrest63960.2025.10914456</w:t>
+            </w:r>
+          </w:p>
+        </w:tc>
+        <w:tc>
+          <w:tcPr>
+            <w:tcW w:type="dxa" w:w="2484"/>
+          </w:tcPr>
+          <w:p>
+            <w:r>
+              <w:t>CONFERENCE</w:t>
+            </w:r>
+          </w:p>
+        </w:tc>
+        <w:tc>
+          <w:tcPr>
+            <w:tcW w:type="dxa" w:w="2484"/>
+          </w:tcPr>
+          <w:p>
+            <w:r>
+              <w:t>15</w:t>
+            </w:r>
+          </w:p>
+        </w:tc>
+      </w:tr>
+      <w:tr>
+        <w:tc>
+          <w:tcPr>
+            <w:tcW w:type="dxa" w:w="2484"/>
+          </w:tcPr>
+          <w:p>
+            <w:r>
+              <w:t>Interactive Telegram Bot as a Support Tool for Teaching in Higher Education</w:t>
+            </w:r>
+          </w:p>
+        </w:tc>
+        <w:tc>
+          <w:tcPr>
+            <w:tcW w:type="dxa" w:w="2484"/>
+          </w:tcPr>
+          <w:p>
+            <w:r>
+              <w:t>10.1007/978-3-031-75016-8_33</w:t>
+            </w:r>
+          </w:p>
+        </w:tc>
+        <w:tc>
+          <w:tcPr>
+            <w:tcW w:type="dxa" w:w="2484"/>
+          </w:tcPr>
+          <w:p>
+            <w:r>
+              <w:t>CONFERENCE</w:t>
+            </w:r>
+          </w:p>
+        </w:tc>
+        <w:tc>
+          <w:tcPr>
+            <w:tcW w:type="dxa" w:w="2484"/>
+          </w:tcPr>
+          <w:p>
+            <w:r>
+              <w:t>15</w:t>
+            </w:r>
+          </w:p>
+        </w:tc>
+      </w:tr>
+      <w:tr>
+        <w:tc>
+          <w:tcPr>
+            <w:tcW w:type="dxa" w:w="2484"/>
+          </w:tcPr>
+          <w:p>
+            <w:r>
+              <w:t>Developing Telegram bot for Text Summarisation using Cohere API</w:t>
+            </w:r>
+          </w:p>
+        </w:tc>
+        <w:tc>
+          <w:tcPr>
+            <w:tcW w:type="dxa" w:w="2484"/>
+          </w:tcPr>
+          <w:p>
+            <w:r>
+              <w:t>10.1109/icaiss61471.2025.11041990</w:t>
+            </w:r>
+          </w:p>
+        </w:tc>
+        <w:tc>
+          <w:tcPr>
+            <w:tcW w:type="dxa" w:w="2484"/>
+          </w:tcPr>
+          <w:p>
+            <w:r>
+              <w:t>CONFERENCE</w:t>
+            </w:r>
+          </w:p>
+        </w:tc>
+        <w:tc>
+          <w:tcPr>
+            <w:tcW w:type="dxa" w:w="2484"/>
+          </w:tcPr>
+          <w:p>
+            <w:r>
+              <w:t>15</w:t>
+            </w:r>
+          </w:p>
+        </w:tc>
+      </w:tr>
+      <w:tr>
+        <w:tc>
+          <w:tcPr>
+            <w:tcW w:type="dxa" w:w="2484"/>
+          </w:tcPr>
+          <w:p>
+            <w:r>
+              <w:t>Design and Construction of a Web-Based Fixed Asset Management System with a Combination of Straight Line Method, MAUT, and Telegram Bot Integration: Case Study of North Lombok District Hospital</w:t>
+            </w:r>
+          </w:p>
+        </w:tc>
+        <w:tc>
+          <w:tcPr>
+            <w:tcW w:type="dxa" w:w="2484"/>
+          </w:tcPr>
+          <w:p>
+            <w:r>
+              <w:t>10.34148/teknika.v13i3.1061</w:t>
+            </w:r>
+          </w:p>
+        </w:tc>
+        <w:tc>
+          <w:tcPr>
+            <w:tcW w:type="dxa" w:w="2484"/>
+          </w:tcPr>
+          <w:p>
+            <w:r>
+              <w:t>JOURNAL</w:t>
+            </w:r>
+          </w:p>
+        </w:tc>
+        <w:tc>
+          <w:tcPr>
+            <w:tcW w:type="dxa" w:w="2484"/>
+          </w:tcPr>
+          <w:p>
+            <w:r>
+              <w:t>15</w:t>
+            </w:r>
+          </w:p>
+        </w:tc>
+      </w:tr>
+      <w:tr>
+        <w:tc>
+          <w:tcPr>
+            <w:tcW w:type="dxa" w:w="2484"/>
+          </w:tcPr>
+          <w:p>
+            <w:r>
+              <w:t>Development of a modular integration system based on Telegram bot with AI for interaction with corporate services and automation of business processes using Python</w:t>
+            </w:r>
+          </w:p>
+        </w:tc>
+        <w:tc>
+          <w:tcPr>
+            <w:tcW w:type="dxa" w:w="2484"/>
+          </w:tcPr>
+          <w:p>
+            <w:r/>
+          </w:p>
+        </w:tc>
+        <w:tc>
+          <w:tcPr>
+            <w:tcW w:type="dxa" w:w="2484"/>
+          </w:tcPr>
+          <w:p>
+            <w:r>
+              <w:t>DISSERTATION</w:t>
+            </w:r>
+          </w:p>
+        </w:tc>
+        <w:tc>
+          <w:tcPr>
+            <w:tcW w:type="dxa" w:w="2484"/>
+          </w:tcPr>
+          <w:p>
+            <w:r>
+              <w:t>15</w:t>
+            </w:r>
+          </w:p>
+        </w:tc>
+      </w:tr>
+      <w:tr>
+        <w:tc>
+          <w:tcPr>
+            <w:tcW w:type="dxa" w:w="2484"/>
+          </w:tcPr>
+          <w:p>
+            <w:r>
+              <w:t>DESIGNING A TELEGRAM BOT WITH WEB SCRAPING CAPABILITIES FOR AUTOMATING SCIENTIFIC ARTICLE DOWNLOADS</w:t>
+            </w:r>
+          </w:p>
+        </w:tc>
+        <w:tc>
+          <w:tcPr>
+            <w:tcW w:type="dxa" w:w="2484"/>
+          </w:tcPr>
+          <w:p>
+            <w:r>
+              <w:t>10.54554/jacta.2024.06.01.004</w:t>
+            </w:r>
+          </w:p>
+        </w:tc>
+        <w:tc>
+          <w:tcPr>
+            <w:tcW w:type="dxa" w:w="2484"/>
+          </w:tcPr>
+          <w:p>
+            <w:r>
+              <w:t>JOURNAL</w:t>
+            </w:r>
+          </w:p>
+        </w:tc>
+        <w:tc>
+          <w:tcPr>
+            <w:tcW w:type="dxa" w:w="2484"/>
+          </w:tcPr>
+          <w:p>
+            <w:r>
+              <w:t>15</w:t>
+            </w:r>
+          </w:p>
+        </w:tc>
+      </w:tr>
+    </w:tbl>
+    <w:p>
+      <w:pPr>
+        <w:pStyle w:val="Heading1"/>
+      </w:pPr>
+      <w:r>
+        <w:t>5. Pipeline Error Log</w:t>
       </w:r>
     </w:p>
     <w:p>
-      <w:pPr>
-        <w:spacing w:line="360" w:lineRule="auto"/>
-        <w:jc w:val="both"/>
-      </w:pPr>
       <w:r>
-        <w:t>Total discovered papers: 322</w:t>
+        <w:t>The pipeline recorded the following messages. This section is diagnostic and does not alter the source dataset.</w:t>
+      </w:r>
+    </w:p>
+    <w:p>
+      <w:r>
+        <w:t>2026-09-25 22:26:28,830 ERROR Error in cleaning: 'publication_year'</w:t>
         <w:br/>
-      </w:r>
-      <w:r>
-        <w:t>Total cleaned papers: 322</w:t>
+        <w:t>Traceback (most recent call last):</w:t>
         <w:br/>
-      </w:r>
-      <w:r>
-        <w:t>DIRECT: 2</w:t>
+        <w:t xml:space="preserve">  File "/Users/jevin/.pyenv/versions/3.12.7/lib/python3.12/site-packages/pandas/core/indexes/base.py", line 3812, in get_loc</w:t>
         <w:br/>
-      </w:r>
-      <w:r>
-        <w:t>RELATED: 4</w:t>
+        <w:t xml:space="preserve">    return self._engine.get_loc(casted_key)</w:t>
         <w:br/>
-      </w:r>
-      <w:r>
-        <w:t>INDIRECT: 48</w:t>
+        <w:t xml:space="preserve">           ^^^^^^^^^^^^^^^^^^^^^^^^^^^^^^^^</w:t>
         <w:br/>
-      </w:r>
-      <w:r>
-        <w:t>IRRELEVANT: 268</w:t>
+        <w:t xml:space="preserve">  File "pandas/_libs/index.pyx", line 167, in pandas._libs.index.IndexEngine.get_loc</w:t>
         <w:br/>
-      </w:r>
-      <w:r>
-        <w:t>DOI valid: 184</w:t>
+        <w:t xml:space="preserve">  File "pandas/_libs/index.pyx", line 196, in pandas._libs.index.IndexEngine.get_loc</w:t>
         <w:br/>
-      </w:r>
-      <w:r>
-        <w:t>DOI invalid: 138</w:t>
+        <w:t xml:space="preserve">  File "pandas/_libs/hashtable_class_helper.pxi", line 7088, in pandas._libs.hashtable.PyObjectHashTable.get_item</w:t>
         <w:br/>
-      </w:r>
-      <w:r>
-        <w:t>Scopus verified venues: 45</w:t>
+        <w:t xml:space="preserve">  File "pandas/_libs/hashtable_class_helper.pxi", line 7096, in pandas._libs.hashtable.PyObjectHashTable.get_item</w:t>
         <w:br/>
-      </w:r>
-      <w:r>
-        <w:t>Scopus Q1 verified articles: 12</w:t>
+        <w:t>KeyError: 'publication_year'</w:t>
+        <w:br/>
+        <w:br/>
+        <w:t>The above exception was the direct cause of the following exception:</w:t>
+        <w:br/>
+        <w:br/>
+        <w:t>Traceback (most recent call last):</w:t>
+        <w:br/>
+        <w:t xml:space="preserve">  File "/Users/jevin/Documents/tesis_mbg/backend/run_telegram_paper_pipeline.py", line 73, in safe_execute</w:t>
+        <w:br/>
+        <w:t xml:space="preserve">    return func(*args, **kwargs)</w:t>
+        <w:br/>
+        <w:t xml:space="preserve">           ^^^^^^^^^^^^^^^^^^^^^</w:t>
+        <w:br/>
+        <w:t xml:space="preserve">  File "/Users/jevin/Documents/tesis_mbg/backend/run_telegram_paper_pipeline.py", line 181, in cleaning</w:t>
+        <w:br/>
+        <w:t xml:space="preserve">    df = df[(df["publication_year"] &gt;= 2024) &amp; (df["publication_year"] &lt;= 2026)]</w:t>
+        <w:br/>
+        <w:t xml:space="preserve">             ~~^^^^^^^^^^^^^^^^^^^^</w:t>
+        <w:br/>
+        <w:t xml:space="preserve">  File "/Users/jevin/.pyenv/versions/3.12.7/lib/python3.12/site-packages/pandas/core/frame.py", line 4107, in __getitem__</w:t>
+        <w:br/>
+        <w:t xml:space="preserve">    indexer = self.columns.get_loc(key)</w:t>
+        <w:br/>
+        <w:t xml:space="preserve">              ^^^^^^^^^^^^^^^^^^^^^^^^^</w:t>
+        <w:br/>
+        <w:t xml:space="preserve">  File "/Users/jevin/.pyenv/versions/3.12.7/lib/python3.12/site-packages/pandas/core/indexes/base.py", line 3819, in get_loc</w:t>
+        <w:br/>
+        <w:t xml:space="preserve">    raise KeyError(key) from err</w:t>
+        <w:br/>
+        <w:t>KeyError: 'publication_year'</w:t>
+        <w:br/>
+        <w:t>2026-09-25 22:26:28,975 ERROR Error in generate_review: invalid literal for int() with base 10: 'UNVERIFIED'</w:t>
+        <w:br/>
+        <w:t>Traceback (most recent call last):</w:t>
+        <w:br/>
+        <w:t xml:space="preserve">  File "/Users/jevin/Documents/tesis_mbg/backend/run_telegram_paper_pipeline.py", line 73, in safe_execute</w:t>
+        <w:br/>
+        <w:t xml:space="preserve">    return func(*args, **kwargs)</w:t>
+        <w:br/>
+        <w:t xml:space="preserve">           ^^^^^^^^^^^^^^^^^^^^^</w:t>
+        <w:br/>
+        <w:t xml:space="preserve">  File "/Users/jevin/Documents/tesis_mbg/backend/run_telegram_paper_pipeline.py", line 540, in generate_review</w:t>
+        <w:br/>
+        <w:t xml:space="preserve">    lines.append(f"- **{row['title']}** ({int(row['publication_year'])}) – DOI: {row.get('doi', 'N/A')} – Citations: {row.get('cited_by_count', '0')} – Category: {row.get('relevance_category')}")</w:t>
+        <w:br/>
+        <w:t xml:space="preserve">                                          ^^^^^^^^^^^^^^^^^^^^^^^^^^^^</w:t>
+        <w:br/>
+        <w:t>ValueError: invalid literal for int() with base 10: 'UNVERIFIED'</w:t>
+        <w:br/>
+        <w:t>2026-09-25 22:26:28,976 ERROR Error in generate_summary: invalid literal for int() with base 10: 'UNVERIFIED'</w:t>
+        <w:br/>
+        <w:t>Traceback (most recent call last):</w:t>
+        <w:br/>
+        <w:t xml:space="preserve">  File "/Users/jevin/Documents/tesis_mbg/backend/run_telegram_paper_pipeline.py", line 73, in safe_execute</w:t>
+        <w:br/>
+        <w:t xml:space="preserve">    return func(*args, **kwargs)</w:t>
+        <w:br/>
+        <w:t xml:space="preserve">           ^^^^^^^^^^^^^^^^^^^^^</w:t>
+        <w:br/>
+        <w:t xml:space="preserve">  File "/Users/jevin/Documents/tesis_mbg/backend/run_telegram_paper_pipeline.py", line 580, in generate_summary</w:t>
+        <w:br/>
+        <w:t xml:space="preserve">    lines.append(f"- {row['title']} ({int(row['publication_year'])}) – Score: {row['composite_score']:.2f}")</w:t>
+        <w:br/>
+        <w:t xml:space="preserve">                                      ^^^^^^^^^^^^^^^^^^^^^^^^^^^^</w:t>
+        <w:br/>
+        <w:t>ValueError: invalid literal for int() with base 10: 'UNVERIFIED'</w:t>
         <w:br/>
       </w:r>
     </w:p>
     <w:p>
       <w:pPr>
         <w:pStyle w:val="Heading1"/>
-        <w:jc w:val="center"/>
       </w:pPr>
       <w:r>
-        <w:t>BAB 2 — LITERATURE REVIEW</w:t>
-      </w:r>
-    </w:p>
-    <w:p>
-      <w:pPr>
-        <w:spacing w:line="360" w:lineRule="auto"/>
-        <w:jc w:val="both"/>
-      </w:pPr>
-      <w:r>
-        <w:t>Key topics covered: Telegram Bot, Telegram Chatbot, AI/NLP on Telegram, Social Network Analysis, Misinformation, etc.</w:t>
-        <w:br/>
-        <w:br/>
-        <w:t>Top papers (by relevance &amp; citations):</w:t>
-        <w:br/>
-      </w:r>
-      <w:r>
-        <w:t>- Enhancing Food Safety in the Cold Chain Through Internet of Things and Artificial Intelligence (2026) – Journal of Food Science</w:t>
-        <w:br/>
-      </w:r>
-      <w:r>
-        <w:t>- Architecture and Design of a Prototype Multi-Modal Clinical Decision Support System for Integrative Medicine (2026) – Longevity Horizon</w:t>
-        <w:br/>
-      </w:r>
-      <w:r>
-        <w:t>- Prigozhin’s Propaganda Team: The St Petersburg Internet Research Agency (2013–2021) (2026) – Europe Asia Studies</w:t>
-        <w:br/>
-      </w:r>
-      <w:r>
-        <w:t>- Use of Artificial Intelligence in Public Health Education for Pandemic Preparedness and Response (2026) – Annals of Global Health</w:t>
-        <w:br/>
-      </w:r>
-      <w:r>
-        <w:t>- A Multimodal Phishing Website Detection System Using Explainable Artificial Intelligence Technologies (2026) – Machine Learning and Knowledge Extraction</w:t>
-        <w:br/>
-      </w:r>
-      <w:r>
-        <w:t>- Online criminal markets on telegram: Exploring the illicit products and services advertised in public group chats (2026) – Computers in Human Behavior</w:t>
-        <w:br/>
-      </w:r>
-      <w:r>
-        <w:t>- IoT-based Farmland Security and Alert System (2026) – Journal of ISMAC</w:t>
-        <w:br/>
-      </w:r>
-      <w:r>
-        <w:t>- Intelligent Systems, Vulnerable Minds: A Framework for Radicalization to Violence in the Age of AI (2026) – Personality and Social Psychology Review</w:t>
-        <w:br/>
-      </w:r>
-      <w:r>
-        <w:t>- IoT-Based LPG Gas Leak Detection System for Real-Time Household Safety Monitoring Integrated with Telegram Bot Notifications (2026) – Jurnal Teknologi Terapan G-Tech</w:t>
-        <w:br/>
-      </w:r>
-      <w:r>
-        <w:t>- Artificial Intelligence and Disinformation in Public Relations: Challenges and Countermeasures (2026) – Mediatization Studies</w:t>
-        <w:br/>
-      </w:r>
-    </w:p>
-    <w:p>
-      <w:pPr>
-        <w:pStyle w:val="Heading1"/>
-        <w:jc w:val="center"/>
-      </w:pPr>
-      <w:r>
-        <w:t>BAB 3 — METHODOLOGY BENCHMARK</w:t>
-      </w:r>
-    </w:p>
-    <w:p>
-      <w:pPr/>
-      <w:r>
-        <w:t>Comparative discussion of methodologies such as SNA, IndoBERT, Emotion, Sarcasm, ABSA, Emoji, Hashtag, Community Detection, Centrality, Topic Analysis, Policy Communication, Marketing 6.0…</w:t>
-      </w:r>
-    </w:p>
-    <w:p>
-      <w:pPr>
-        <w:pStyle w:val="Heading1"/>
-        <w:jc w:val="center"/>
-      </w:pPr>
-      <w:r>
-        <w:t>BAB 4 — RESEARCH GAP</w:t>
-      </w:r>
-    </w:p>
-    <w:p>
-      <w:pPr/>
-      <w:r>
-        <w:t>Identified gaps: Dataset, Platform, Method, NLP, SNA, Sarcasm, Emotion, Multimodal, Policy Communication, Marketing 6.0…</w:t>
-      </w:r>
-    </w:p>
-    <w:p>
-      <w:pPr>
-        <w:pStyle w:val="Heading1"/>
-        <w:jc w:val="center"/>
-      </w:pPr>
-      <w:r>
-        <w:t>BAB 5 — RELEVANCE TO THESIS</w:t>
-      </w:r>
-    </w:p>
-    <w:p>
-      <w:pPr/>
-      <w:r>
-        <w:t>The retrieved literature provides evidence for applying SNA and NLP techniques on Telegram data, which aligns with the thesis on Twitter sarcasm analysis…</w:t>
-      </w:r>
-    </w:p>
-    <w:p>
-      <w:pPr>
-        <w:pStyle w:val="Heading1"/>
-        <w:jc w:val="center"/>
-      </w:pPr>
-      <w:r>
-        <w:t>BAB 6 — FINAL CANDIDATES</w:t>
-      </w:r>
-    </w:p>
-    <w:p>
-      <w:pPr/>
-      <w:r>
-        <w:t>Highest‑relevance candidates (up to 30) based on relevance screening and citation count are listed in the appendix of the markdown report.</w:t>
-      </w:r>
-    </w:p>
-    <w:p>
-      <w:pPr>
-        <w:pStyle w:val="Heading1"/>
-        <w:jc w:val="center"/>
-      </w:pPr>
-      <w:r>
-        <w:t>BAB 7 — REFERENCES</w:t>
+        <w:t>6. Generated Output Files</w:t>
       </w:r>
     </w:p>
     <w:p>
       <w:r>
-        <w:t>1. Enhancing Food Safety in the Cold Chain Through Internet of Things and Artificial Intelligence – https://doi.org/10.1111/1750-3841.70871</w:t>
-        <w:br/>
+        <w:t>01_discovery.csv — 103,429 bytes</w:t>
       </w:r>
+    </w:p>
+    <w:p>
       <w:r>
-        <w:t>2. Architecture and Design of a Prototype Multi-Modal Clinical Decision Support System for Integrative Medicine – https://doi.org/10.65649/4cxxhe47</w:t>
-        <w:br/>
+        <w:t>02_relevance_matrix.csv — 142,398 bytes</w:t>
       </w:r>
+    </w:p>
+    <w:p>
       <w:r>
-        <w:t>3. Prigozhin’s Propaganda Team: The St Petersburg Internet Research Agency (2013–2021) – https://doi.org/10.1080/09668136.2025.2588334</w:t>
-        <w:br/>
+        <w:t>03_doi_validation.csv — 141,597 bytes</w:t>
       </w:r>
+    </w:p>
+    <w:p>
       <w:r>
-        <w:t>4. Use of Artificial Intelligence in Public Health Education for Pandemic Preparedness and Response – https://doi.org/10.5334/aogh.5130</w:t>
-        <w:br/>
+        <w:t>03_relevance_screening.csv — 123,536 bytes</w:t>
       </w:r>
+    </w:p>
+    <w:p>
       <w:r>
-        <w:t>5. A Multimodal Phishing Website Detection System Using Explainable Artificial Intelligence Technologies – https://doi.org/10.3390/make8010011</w:t>
-        <w:br/>
+        <w:t>04_doi_validation.csv — 132,637 bytes</w:t>
       </w:r>
+    </w:p>
+    <w:p>
       <w:r>
-        <w:t>6. Online criminal markets on telegram: Exploring the illicit products and services advertised in public group chats – https://doi.org/10.1016/j.chb.2026.109032</w:t>
-        <w:br/>
+        <w:t>04_journal_validation.csv — 147,962 bytes</w:t>
       </w:r>
+    </w:p>
+    <w:p>
       <w:r>
-        <w:t>7. IoT-based Farmland Security and Alert System – https://doi.org/10.36548/jismac.2026.2.006</w:t>
-        <w:br/>
+        <w:t>05_journal_validation.csv — 169,671 bytes</w:t>
       </w:r>
+    </w:p>
+    <w:p>
       <w:r>
-        <w:t>8. Intelligent Systems, Vulnerable Minds: A Framework for Radicalization to Violence in the Age of AI – https://doi.org/10.1177/10888683261430089</w:t>
-        <w:br/>
+        <w:t>05_scopus_verification.csv — 161,205 bytes</w:t>
       </w:r>
+    </w:p>
+    <w:p>
       <w:r>
-        <w:t>9. IoT-Based LPG Gas Leak Detection System for Real-Time Household Safety Monitoring Integrated with Telegram Bot Notifications – https://doi.org/10.70609/g-tech.v10i1.8650</w:t>
-        <w:br/>
+        <w:t>06_q1_candidates.csv — 165,281 bytes</w:t>
       </w:r>
+    </w:p>
+    <w:p>
       <w:r>
-        <w:t>10. Artificial Intelligence and Disinformation in Public Relations: Challenges and Countermeasures – https://doi.org/10.17951/ms.2025.9.97-115</w:t>
-        <w:br/>
+        <w:t>06_scopus_verification.csv — 180,352 bytes</w:t>
       </w:r>
+    </w:p>
+    <w:p>
       <w:r>
-        <w:t>11. Next-Generation Artificial Intelligence for Sustainable and Intelligent Food Production Systems: A Review – https://doi.org/10.48185/jaai.v7i1.2044</w:t>
-        <w:br/>
+        <w:t>07_methodology_matrix.csv — 239,288 bytes</w:t>
       </w:r>
+    </w:p>
+    <w:p>
       <w:r>
-        <w:t>12. DEIT-Based Feature Extraction with Ensemble Machine Learning for Accurate Bone Fracture Detection in X-Ray Images – https://doi.org/10.64751/ajmimc.2026.v5.n2.pp212-220</w:t>
-        <w:br/>
+        <w:t>07_q1_verification.csv — 201,693 bytes</w:t>
       </w:r>
+    </w:p>
+    <w:p>
       <w:r>
-        <w:t>13. Real-time Fall Detection Prototyping with YOLOv11 Using an Integrated Multi-dataset Framework – https://doi.org/10.22266/ijies2026.0228.16</w:t>
-        <w:br/>
+        <w:t>08_methodology_matrix.csv — 222,258 bytes</w:t>
       </w:r>
+    </w:p>
+    <w:p>
       <w:r>
-        <w:t>14. IoT-Based Home Security System: ESP32-CAM Integration and Real-Time Notification – https://doi.org/10.33050/itee.v4i2.956</w:t>
-        <w:br/>
+        <w:t>08_research_gap_matrix.csv — 270,265 bytes</w:t>
       </w:r>
+    </w:p>
+    <w:p>
       <w:r>
-        <w:t>15. Smart cold chains for food systems: IoT monitoring, predictive analytics, and emerging technologies – https://doi.org/10.20935/acadeng8291</w:t>
-        <w:br/>
+        <w:t>09_method_benchmark.csv — 77,766 bytes</w:t>
       </w:r>
+    </w:p>
+    <w:p>
       <w:r>
-        <w:t>16. Participant recruitment during war: challenges and strategies from the longitudinal mental health assessment of the population study in Ukraine – https://doi.org/10.1093/ajeadv/uuag010</w:t>
-        <w:br/>
+        <w:t>10_research_gap_matrix.csv — 331 bytes</w:t>
       </w:r>
+    </w:p>
+    <w:p>
       <w:r>
-        <w:t>17. Open Source Information as a Window into the War in Ukraine – https://doi.org/10.1007/978-3-032-11892-9_7</w:t>
-        <w:br/>
+        <w:t>11_final_candidates.csv — 30,449 bytes</w:t>
       </w:r>
+    </w:p>
+    <w:p>
       <w:r>
-        <w:t>18. USING A TELEGRAM BOT IN ORGANIZING STUDENTS' INDEPENDENT VOCABULARY WORK IN LEARNING ENGLISH – https://doi.org/10.62957/2949-3269-2026-68-2-52-56</w:t>
-        <w:br/>
+        <w:t>12_telegram_literature_master.csv — 161,813 bytes</w:t>
       </w:r>
+    </w:p>
+    <w:p>
       <w:r>
-        <w:t>19. Telegram Bot for Calorie Intake Tracking Using Natural Language Processing – nan</w:t>
-        <w:br/>
+        <w:t>FINAL_PIPELINE_REPORT.txt — 5,255 bytes</w:t>
       </w:r>
+    </w:p>
+    <w:p>
       <w:r>
-        <w:t>20. COMPARISON OF TELEGRAM BOT FOR TEXT GENERATION BUILT ON OPENAI AND GEMINIAI – https://doi.org/10.28925/2663-4023.2026.32.1063</w:t>
-        <w:br/>
+        <w:t>FINAL_TELEGRAM_LITERATURE_RESEARCH.docx — 41,899 bytes</w:t>
+      </w:r>
+    </w:p>
+    <w:p>
+      <w:r>
+        <w:t>TELEGRAM_BOT_LITERATURE_REVIEW.md — 751 bytes</w:t>
+      </w:r>
+    </w:p>
+    <w:p>
+      <w:r>
+        <w:t>pipeline_errors.log — 3,071 bytes</w:t>
+      </w:r>
+    </w:p>
+    <w:p>
+      <w:r>
+        <w:t>telegram_literature_master.csv — 270,265 bytes</w:t>
+      </w:r>
+    </w:p>
+    <w:p>
+      <w:r>
+        <w:t>telegram_literature_summary.txt — 394 bytes</w:t>
       </w:r>
     </w:p>
     <w:sectPr>
-      <w:pgSz w:w="11906" w:h="16838"/>
-      <w:pgMar w:top="2268" w:right="1701" w:bottom="1701" w:left="2268" w:header="720" w:footer="720" w:gutter="0"/>
+      <w:pgSz w:w="12240" w:h="15840"/>
+      <w:pgMar w:top="1008" w:right="1152" w:bottom="1008" w:left="1152" w:header="720" w:footer="720" w:gutter="0"/>
       <w:cols w:space="720"/>
       <w:docGrid w:linePitch="360"/>
     </w:sectPr>
@@ -662,6 +2845,10 @@
     <w:name w:val="Normal"/>
     <w:qFormat/>
     <w:rsid w:val="00FC693F"/>
+    <w:rPr>
+      <w:rFonts w:ascii="Times New Roman" w:hAnsi="Times New Roman"/>
+      <w:sz w:val="20"/>
+    </w:rPr>
   </w:style>
   <w:style w:type="paragraph" w:styleId="Header">
     <w:name w:val="header"/>

</xml_diff>